<commit_message>
Modificacion en el codigo importador.py y creacion incial del codigo db_manager,  ademas de actualizacion de la BD y su documentacion.
</commit_message>
<xml_diff>
--- a/docs/Semaforo_Alerta_Base_de_Datos.docx
+++ b/docs/Semaforo_Alerta_Base_de_Datos.docx
@@ -218,10 +218,30 @@
         <w:ind w:left="1080"/>
       </w:pPr>
       <w:r>
-        <w:t>Id_Carrera</w:t>
-      </w:r>
-      <w:r>
-        <w:br/>
+        <w:t xml:space="preserve">  </w:t>
+      </w:r>
+      <w:r>
+        <w:rPr>
+          <w:lang w:val="en-US"/>
+        </w:rPr>
+        <w:t xml:space="preserve">    I</w:t>
+      </w:r>
+      <w:r>
+        <w:t>d_Carrera</w:t>
+      </w:r>
+    </w:p>
+    <w:p>
+      <w:pPr>
+        <w:pStyle w:val="Prrafodelista"/>
+        <w:ind w:left="1080"/>
+      </w:pPr>
+      <w:r>
+        <w:t xml:space="preserve"> </w:t>
+      </w:r>
+      <w:r>
+        <w:tab/>
+      </w:r>
+      <w:r>
         <w:t>Turno</w:t>
       </w:r>
     </w:p>
@@ -317,12 +337,8 @@
       </w:r>
       <w:r>
         <w:br/>
-      </w:r>
-      <w:proofErr w:type="spellStart"/>
-      <w:r>
         <w:t>Id_Carrera</w:t>
       </w:r>
-      <w:proofErr w:type="spellEnd"/>
       <w:r>
         <w:br/>
         <w:t>Periodo</w:t>
@@ -357,46 +373,30 @@
           <w:b/>
           <w:bCs/>
         </w:rPr>
-        <w:t>Importaciones</w:t>
+        <w:t>Aulas</w:t>
       </w:r>
     </w:p>
     <w:p>
       <w:pPr>
         <w:pStyle w:val="Prrafodelista"/>
         <w:ind w:left="1353"/>
-        <w:rPr>
-          <w:b/>
-          <w:bCs/>
-        </w:rPr>
-      </w:pPr>
-      <w:r>
-        <w:t>Id_Importacion</w:t>
-      </w:r>
-      <w:r>
-        <w:br/>
-        <w:t>Id_Grupo</w:t>
-      </w:r>
-      <w:r>
-        <w:br/>
-        <w:t>Periodo</w:t>
-      </w:r>
-      <w:r>
-        <w:br/>
-        <w:t>Archivo</w:t>
-      </w:r>
-      <w:r>
-        <w:br/>
-        <w:t>Importado_por</w:t>
-      </w:r>
-      <w:r>
-        <w:br/>
-        <w:t>Fecha</w:t>
-      </w:r>
-    </w:p>
-    <w:p>
-      <w:pPr>
-        <w:pStyle w:val="Prrafodelista"/>
-        <w:ind w:left="1080"/>
+      </w:pPr>
+      <w:r>
+        <w:t>Id_Aula</w:t>
+      </w:r>
+      <w:r>
+        <w:br/>
+        <w:t>Nombre</w:t>
+      </w:r>
+      <w:r>
+        <w:br/>
+        <w:t>Tipo</w:t>
+      </w:r>
+    </w:p>
+    <w:p>
+      <w:pPr>
+        <w:pStyle w:val="Prrafodelista"/>
+        <w:ind w:left="1353"/>
       </w:pPr>
     </w:p>
     <w:p>
@@ -406,57 +406,57 @@
           <w:ilvl w:val="0"/>
           <w:numId w:val="2"/>
         </w:numPr>
-      </w:pPr>
-      <w:r>
-        <w:rPr>
-          <w:b/>
-          <w:bCs/>
-        </w:rPr>
-        <w:t>Calificaciones</w:t>
-      </w:r>
-      <w:r>
-        <w:br/>
-        <w:t>Id_Calificacion</w:t>
-      </w:r>
-      <w:r>
-        <w:br/>
-        <w:t>Matricula</w:t>
-      </w:r>
-      <w:r>
-        <w:br/>
-        <w:t>Id_Materia</w:t>
-      </w:r>
-      <w:r>
-        <w:br/>
+        <w:rPr>
+          <w:b/>
+          <w:bCs/>
+        </w:rPr>
+      </w:pPr>
+      <w:r>
+        <w:rPr>
+          <w:b/>
+          <w:bCs/>
+        </w:rPr>
+        <w:t>Importaciones</w:t>
+      </w:r>
+    </w:p>
+    <w:p>
+      <w:pPr>
+        <w:pStyle w:val="Prrafodelista"/>
+        <w:ind w:left="1353"/>
+        <w:rPr>
+          <w:b/>
+          <w:bCs/>
+        </w:rPr>
+      </w:pPr>
+      <w:r>
         <w:t>Id_Importacion</w:t>
       </w:r>
       <w:r>
         <w:br/>
+        <w:t>Id_Grupo</w:t>
+      </w:r>
+      <w:r>
+        <w:br/>
         <w:t>Periodo</w:t>
       </w:r>
       <w:r>
         <w:br/>
-        <w:t>P1</w:t>
-      </w:r>
-      <w:r>
-        <w:br/>
-        <w:t>P2</w:t>
-      </w:r>
-      <w:r>
-        <w:br/>
-        <w:t>P3</w:t>
-      </w:r>
-      <w:r>
-        <w:br/>
-        <w:t>PR</w:t>
-      </w:r>
-      <w:r>
-        <w:br/>
-        <w:t>Aprobado</w:t>
-      </w:r>
-      <w:r>
-        <w:br/>
-      </w:r>
+        <w:t>Archivo</w:t>
+      </w:r>
+      <w:r>
+        <w:br/>
+        <w:t>Importado_por</w:t>
+      </w:r>
+      <w:r>
+        <w:br/>
+        <w:t>Fecha</w:t>
+      </w:r>
+    </w:p>
+    <w:p>
+      <w:pPr>
+        <w:pStyle w:val="Prrafodelista"/>
+        <w:ind w:left="1080"/>
+      </w:pPr>
     </w:p>
     <w:p>
       <w:pPr>
@@ -471,45 +471,54 @@
           <w:b/>
           <w:bCs/>
         </w:rPr>
-        <w:t>Niveles_Alerta</w:t>
-      </w:r>
-      <w:r>
-        <w:br/>
-        <w:t>Id_Nivel</w:t>
-      </w:r>
-      <w:r>
-        <w:br/>
-        <w:t>Nombre</w:t>
-      </w:r>
-      <w:r>
-        <w:br/>
-        <w:t>Color_Hex</w:t>
-      </w:r>
-      <w:r>
-        <w:br/>
-        <w:t>Min_Reprobadas</w:t>
-      </w:r>
-      <w:r>
-        <w:br/>
-        <w:t>Max_Reprobadas</w:t>
-      </w:r>
-      <w:r>
-        <w:br/>
-        <w:t>Descripcion</w:t>
-      </w:r>
-    </w:p>
-    <w:p>
-      <w:pPr>
-        <w:pStyle w:val="Prrafodelista"/>
-        <w:ind w:left="1080"/>
-      </w:pPr>
-    </w:p>
-    <w:p>
-      <w:pPr>
-        <w:pStyle w:val="Prrafodelista"/>
-        <w:ind w:left="1080"/>
-      </w:pPr>
-    </w:p>
+        <w:t>Calificaciones</w:t>
+      </w:r>
+      <w:r>
+        <w:br/>
+        <w:t>Id_Calificacion</w:t>
+      </w:r>
+      <w:r>
+        <w:br/>
+        <w:t>Matricula</w:t>
+      </w:r>
+      <w:r>
+        <w:br/>
+        <w:t>Id_Materia</w:t>
+      </w:r>
+      <w:r>
+        <w:br/>
+        <w:t>Id_Importacion</w:t>
+      </w:r>
+      <w:r>
+        <w:br/>
+        <w:t>Periodo</w:t>
+      </w:r>
+      <w:r>
+        <w:br/>
+        <w:t>P1</w:t>
+      </w:r>
+      <w:r>
+        <w:br/>
+        <w:t>P2</w:t>
+      </w:r>
+      <w:r>
+        <w:br/>
+        <w:t>P3</w:t>
+      </w:r>
+      <w:r>
+        <w:br/>
+        <w:t>PR</w:t>
+      </w:r>
+      <w:r>
+        <w:br/>
+        <w:t>Aprobado</w:t>
+      </w:r>
+      <w:r>
+        <w:br/>
+      </w:r>
+    </w:p>
+    <w:p/>
+    <w:p/>
     <w:p>
       <w:pPr>
         <w:pStyle w:val="Prrafodelista"/>
@@ -524,19 +533,7 @@
           <w:bCs/>
         </w:rPr>
         <w:lastRenderedPageBreak/>
-        <w:t>Alertas</w:t>
-      </w:r>
-      <w:r>
-        <w:br/>
-        <w:t>Id_Alerta</w:t>
-      </w:r>
-      <w:r>
-        <w:br/>
-        <w:t>Matricula</w:t>
-      </w:r>
-      <w:r>
-        <w:br/>
-        <w:t>Periodo</w:t>
+        <w:t>Niveles_Alerta</w:t>
       </w:r>
       <w:r>
         <w:br/>
@@ -544,19 +541,36 @@
       </w:r>
       <w:r>
         <w:br/>
-        <w:t>Materias_Reprobadas</w:t>
-      </w:r>
-      <w:r>
-        <w:br/>
-        <w:t>PAC</w:t>
-      </w:r>
-      <w:r>
-        <w:br/>
-        <w:t>Fecha_Calculo</w:t>
-      </w:r>
-      <w:r>
-        <w:br/>
-      </w:r>
+        <w:t>Nombre</w:t>
+      </w:r>
+      <w:r>
+        <w:br/>
+        <w:t>Color_Hex</w:t>
+      </w:r>
+      <w:r>
+        <w:br/>
+        <w:t>Min_Reprobadas</w:t>
+      </w:r>
+      <w:r>
+        <w:br/>
+        <w:t>Max_Reprobadas</w:t>
+      </w:r>
+      <w:r>
+        <w:br/>
+        <w:t>Descripcion</w:t>
+      </w:r>
+    </w:p>
+    <w:p>
+      <w:pPr>
+        <w:pStyle w:val="Prrafodelista"/>
+        <w:ind w:left="1080"/>
+      </w:pPr>
+    </w:p>
+    <w:p>
+      <w:pPr>
+        <w:pStyle w:val="Prrafodelista"/>
+        <w:ind w:left="1080"/>
+      </w:pPr>
     </w:p>
     <w:p>
       <w:pPr>
@@ -571,23 +585,35 @@
           <w:b/>
           <w:bCs/>
         </w:rPr>
-        <w:t>Tutor_Grupo</w:t>
-      </w:r>
-      <w:r>
-        <w:br/>
-        <w:t>Id_Tutor_Grupo</w:t>
-      </w:r>
-      <w:r>
-        <w:br/>
-        <w:t>Id_Usuario</w:t>
-      </w:r>
-      <w:r>
-        <w:br/>
-        <w:t>Id_Grupo</w:t>
+        <w:t>Alertas</w:t>
+      </w:r>
+      <w:r>
+        <w:br/>
+        <w:t>Id_Alerta</w:t>
+      </w:r>
+      <w:r>
+        <w:br/>
+        <w:t>Matricula</w:t>
       </w:r>
       <w:r>
         <w:br/>
         <w:t>Periodo</w:t>
+      </w:r>
+      <w:r>
+        <w:br/>
+        <w:t>Id_Nivel</w:t>
+      </w:r>
+      <w:r>
+        <w:br/>
+        <w:t>Materias_Reprobadas</w:t>
+      </w:r>
+      <w:r>
+        <w:br/>
+        <w:t>PAC</w:t>
+      </w:r>
+      <w:r>
+        <w:br/>
+        <w:t>Fecha_Calculo</w:t>
       </w:r>
       <w:r>
         <w:br/>
@@ -606,11 +632,11 @@
           <w:b/>
           <w:bCs/>
         </w:rPr>
-        <w:t>Horarios</w:t>
-      </w:r>
-      <w:r>
-        <w:br/>
-        <w:t>Id_Horario</w:t>
+        <w:t>Tutor_Grupo</w:t>
+      </w:r>
+      <w:r>
+        <w:br/>
+        <w:t>Id_Tutor_Grupo</w:t>
       </w:r>
       <w:r>
         <w:br/>
@@ -622,36 +648,16 @@
       </w:r>
       <w:r>
         <w:br/>
-        <w:t>Id_Materia</w:t>
-      </w:r>
-      <w:r>
-        <w:br/>
-        <w:t>Dia_Semana</w:t>
-      </w:r>
-      <w:r>
-        <w:br/>
-        <w:t>Hora_Inicio</w:t>
-      </w:r>
-    </w:p>
-    <w:p>
-      <w:pPr>
-        <w:pStyle w:val="Prrafodelista"/>
-        <w:ind w:left="1353"/>
-      </w:pPr>
-      <w:r>
-        <w:t>Hora_Fin</w:t>
-      </w:r>
-      <w:r>
-        <w:br/>
-        <w:t>Aula</w:t>
-      </w:r>
-    </w:p>
-    <w:p>
-      <w:pPr>
-        <w:pStyle w:val="Prrafodelista"/>
-        <w:ind w:left="1080"/>
-      </w:pPr>
-    </w:p>
+        <w:t>Periodo</w:t>
+      </w:r>
+      <w:r>
+        <w:br/>
+      </w:r>
+    </w:p>
+    <w:p/>
+    <w:p/>
+    <w:p/>
+    <w:p/>
     <w:p>
       <w:pPr>
         <w:pStyle w:val="Prrafodelista"/>
@@ -665,15 +671,11 @@
           <w:b/>
           <w:bCs/>
         </w:rPr>
-        <w:t>Observaciones</w:t>
-      </w:r>
-      <w:r>
-        <w:br/>
-        <w:t>Id_Observacion</w:t>
-      </w:r>
-      <w:r>
-        <w:br/>
-        <w:t>Matricula</w:t>
+        <w:t>Horarios</w:t>
+      </w:r>
+      <w:r>
+        <w:br/>
+        <w:t>Id_Horario</w:t>
       </w:r>
       <w:r>
         <w:br/>
@@ -681,15 +683,35 @@
       </w:r>
       <w:r>
         <w:br/>
-        <w:t>Comentario</w:t>
-      </w:r>
-      <w:r>
-        <w:br/>
-        <w:t>Fecha</w:t>
-      </w:r>
-      <w:r>
-        <w:br/>
-      </w:r>
+        <w:t>Id_Grupo</w:t>
+      </w:r>
+      <w:r>
+        <w:br/>
+        <w:t>Id_Materia</w:t>
+      </w:r>
+      <w:r>
+        <w:br/>
+        <w:t>Dia_Semana</w:t>
+      </w:r>
+      <w:r>
+        <w:br/>
+        <w:t>Hora_Inicio</w:t>
+      </w:r>
+    </w:p>
+    <w:p>
+      <w:pPr>
+        <w:pStyle w:val="Prrafodelista"/>
+        <w:ind w:left="1353"/>
+      </w:pPr>
+      <w:r>
+        <w:t>Hora_Fin</w:t>
+      </w:r>
+    </w:p>
+    <w:p>
+      <w:pPr>
+        <w:pStyle w:val="Prrafodelista"/>
+        <w:ind w:left="1080"/>
+      </w:pPr>
     </w:p>
     <w:p>
       <w:pPr>
@@ -698,21 +720,21 @@
           <w:ilvl w:val="0"/>
           <w:numId w:val="2"/>
         </w:numPr>
-        <w:rPr>
-          <w:b/>
-          <w:bCs/>
-        </w:rPr>
-      </w:pPr>
-      <w:r>
-        <w:rPr>
-          <w:b/>
-          <w:bCs/>
-        </w:rPr>
-        <w:t>Padre_Alumno</w:t>
-      </w:r>
-      <w:r>
-        <w:br/>
-        <w:t>Id_Padre_Alumno</w:t>
+      </w:pPr>
+      <w:r>
+        <w:rPr>
+          <w:b/>
+          <w:bCs/>
+        </w:rPr>
+        <w:t>Observaciones</w:t>
+      </w:r>
+      <w:r>
+        <w:br/>
+        <w:t>Id_Observacion</w:t>
+      </w:r>
+      <w:r>
+        <w:br/>
+        <w:t>Matricula</w:t>
       </w:r>
       <w:r>
         <w:br/>
@@ -720,7 +742,11 @@
       </w:r>
       <w:r>
         <w:br/>
-        <w:t>Matricula</w:t>
+        <w:t>Comentario</w:t>
+      </w:r>
+      <w:r>
+        <w:br/>
+        <w:t>Fecha</w:t>
       </w:r>
       <w:r>
         <w:br/>
@@ -733,17 +759,25 @@
           <w:ilvl w:val="0"/>
           <w:numId w:val="2"/>
         </w:numPr>
-      </w:pPr>
-      <w:r>
-        <w:rPr>
-          <w:b/>
-          <w:bCs/>
-        </w:rPr>
-        <w:t>Notificaciones</w:t>
-      </w:r>
-      <w:r>
-        <w:br/>
-        <w:t>Id_Notificacion</w:t>
+        <w:rPr>
+          <w:b/>
+          <w:bCs/>
+        </w:rPr>
+      </w:pPr>
+      <w:r>
+        <w:rPr>
+          <w:b/>
+          <w:bCs/>
+        </w:rPr>
+        <w:t>Padre_Alumno</w:t>
+      </w:r>
+      <w:r>
+        <w:br/>
+        <w:t>Id_Padre_Alumno</w:t>
+      </w:r>
+      <w:r>
+        <w:br/>
+        <w:t>Id_Usuario</w:t>
       </w:r>
       <w:r>
         <w:br/>
@@ -751,30 +785,15 @@
       </w:r>
       <w:r>
         <w:br/>
-        <w:t>Destinatario</w:t>
-      </w:r>
-      <w:r>
-        <w:br/>
-        <w:t>Asunto</w:t>
-      </w:r>
-      <w:r>
-        <w:br/>
-        <w:t>Cuerpo</w:t>
-      </w:r>
-      <w:r>
-        <w:br/>
-        <w:t>Fecha_Enviado</w:t>
-      </w:r>
-      <w:r>
-        <w:br/>
-      </w:r>
-      <w:r>
-        <w:t>Estado</w:t>
-      </w:r>
-    </w:p>
-    <w:p/>
-    <w:p>
-      <w:pPr>
+      </w:r>
+    </w:p>
+    <w:p>
+      <w:pPr>
+        <w:pStyle w:val="Prrafodelista"/>
+        <w:numPr>
+          <w:ilvl w:val="0"/>
+          <w:numId w:val="2"/>
+        </w:numPr>
         <w:sectPr>
           <w:type w:val="continuous"/>
           <w:pgSz w:w="11906" w:h="16838"/>
@@ -783,10 +802,49 @@
           <w:docGrid w:linePitch="360"/>
         </w:sectPr>
       </w:pPr>
-    </w:p>
-    <w:p>
-      <w:pPr>
-        <w:pStyle w:val="Prrafodelista"/>
+      <w:r>
+        <w:rPr>
+          <w:b/>
+          <w:bCs/>
+        </w:rPr>
+        <w:t>Notificaciones</w:t>
+      </w:r>
+      <w:r>
+        <w:br/>
+        <w:t>Id_Notificacion</w:t>
+      </w:r>
+      <w:r>
+        <w:br/>
+        <w:t>Matricula</w:t>
+      </w:r>
+      <w:r>
+        <w:br/>
+        <w:t>Destinatario</w:t>
+      </w:r>
+      <w:r>
+        <w:br/>
+        <w:t>Asunto</w:t>
+      </w:r>
+      <w:r>
+        <w:br/>
+        <w:t>Cuerpo</w:t>
+      </w:r>
+      <w:r>
+        <w:br/>
+        <w:t>Fecha_Enviado</w:t>
+      </w:r>
+      <w:r>
+        <w:br/>
+      </w:r>
+      <w:r>
+        <w:t>Esta</w:t>
+      </w:r>
+      <w:r>
+        <w:t>do</w:t>
+      </w:r>
+    </w:p>
+    <w:p>
+      <w:pPr>
         <w:rPr>
           <w:sz w:val="22"/>
           <w:szCs w:val="22"/>
@@ -821,16 +879,16 @@
           <w:noProof/>
         </w:rPr>
         <w:drawing>
-          <wp:anchor distT="0" distB="0" distL="114300" distR="114300" simplePos="0" relativeHeight="251658240" behindDoc="0" locked="0" layoutInCell="1" allowOverlap="1" wp14:anchorId="1B7DAD8C" wp14:editId="3170D873">
+          <wp:anchor distT="0" distB="0" distL="114300" distR="114300" simplePos="0" relativeHeight="251658240" behindDoc="0" locked="0" layoutInCell="1" allowOverlap="1" wp14:anchorId="1B7DAD8C" wp14:editId="2A1C5F5B">
             <wp:simplePos x="0" y="0"/>
-            <wp:positionH relativeFrom="column">
-              <wp:posOffset>478302</wp:posOffset>
+            <wp:positionH relativeFrom="margin">
+              <wp:align>center</wp:align>
             </wp:positionH>
             <wp:positionV relativeFrom="paragraph">
-              <wp:posOffset>32873</wp:posOffset>
+              <wp:posOffset>53389</wp:posOffset>
             </wp:positionV>
             <wp:extent cx="4846320" cy="864870"/>
-            <wp:effectExtent l="0" t="0" r="0" b="0"/>
+            <wp:effectExtent l="19050" t="19050" r="11430" b="11430"/>
             <wp:wrapNone/>
             <wp:docPr id="1139189501" name="Imagen 1"/>
             <wp:cNvGraphicFramePr>
@@ -858,11 +916,16 @@
                   <pic:spPr>
                     <a:xfrm>
                       <a:off x="0" y="0"/>
-                      <a:ext cx="4869560" cy="869017"/>
+                      <a:ext cx="4846320" cy="864870"/>
                     </a:xfrm>
                     <a:prstGeom prst="rect">
                       <a:avLst/>
                     </a:prstGeom>
+                    <a:ln>
+                      <a:solidFill>
+                        <a:schemeClr val="accent1"/>
+                      </a:solidFill>
+                    </a:ln>
                   </pic:spPr>
                 </pic:pic>
               </a:graphicData>
@@ -886,9 +949,6 @@
       </w:pPr>
     </w:p>
     <w:p>
-      <w:pPr>
-        <w:ind w:left="708" w:firstLine="2"/>
-      </w:pPr>
       <w:r>
         <w:br/>
       </w:r>
@@ -899,56 +959,94 @@
           <w:sz w:val="22"/>
           <w:szCs w:val="22"/>
         </w:rPr>
-        <w:t>CHARACTER SET</w:t>
-      </w:r>
-      <w:r>
-        <w:rPr>
+        <w:t xml:space="preserve"> </w:t>
+      </w:r>
+      <w:r>
+        <w:rPr>
+          <w:b/>
+          <w:bCs/>
           <w:sz w:val="22"/>
           <w:szCs w:val="22"/>
         </w:rPr>
-        <w:t xml:space="preserve"> -- Define qué letras y símbolos puede guardar</w:t>
-      </w:r>
-      <w:r>
-        <w:rPr>
+        <w:tab/>
+      </w:r>
+      <w:r>
+        <w:rPr>
+          <w:b/>
+          <w:bCs/>
           <w:sz w:val="22"/>
           <w:szCs w:val="22"/>
         </w:rPr>
-        <w:t xml:space="preserve"> y entender</w:t>
+        <w:t>CHARACTER SET</w:t>
       </w:r>
       <w:r>
         <w:rPr>
           <w:sz w:val="22"/>
           <w:szCs w:val="22"/>
         </w:rPr>
-        <w:t xml:space="preserve"> la</w:t>
+        <w:t xml:space="preserve"> -- Define qué letras y símbolos puede guardar</w:t>
       </w:r>
       <w:r>
         <w:rPr>
           <w:sz w:val="22"/>
           <w:szCs w:val="22"/>
         </w:rPr>
-        <w:br/>
-        <w:t xml:space="preserve">base de </w:t>
+        <w:t xml:space="preserve"> y entender</w:t>
       </w:r>
       <w:r>
         <w:rPr>
           <w:sz w:val="22"/>
           <w:szCs w:val="22"/>
         </w:rPr>
-        <w:t>datos sin romperse</w:t>
+        <w:t xml:space="preserve"> la</w:t>
       </w:r>
       <w:r>
         <w:rPr>
           <w:sz w:val="22"/>
           <w:szCs w:val="22"/>
         </w:rPr>
-        <w:t xml:space="preserve">. </w:t>
+        <w:br/>
       </w:r>
       <w:r>
         <w:rPr>
           <w:sz w:val="22"/>
           <w:szCs w:val="22"/>
         </w:rPr>
+        <w:t xml:space="preserve"> </w:t>
+      </w:r>
+      <w:r>
+        <w:rPr>
+          <w:sz w:val="22"/>
+          <w:szCs w:val="22"/>
+        </w:rPr>
+        <w:tab/>
+      </w:r>
+      <w:r>
+        <w:rPr>
+          <w:sz w:val="22"/>
+          <w:szCs w:val="22"/>
+        </w:rPr>
+        <w:t xml:space="preserve">base de </w:t>
+      </w:r>
+      <w:r>
+        <w:rPr>
+          <w:sz w:val="22"/>
+          <w:szCs w:val="22"/>
+        </w:rPr>
+        <w:t>datos sin romperse</w:t>
+      </w:r>
+      <w:r>
+        <w:rPr>
+          <w:sz w:val="22"/>
+          <w:szCs w:val="22"/>
+        </w:rPr>
+        <w:t xml:space="preserve">. </w:t>
+      </w:r>
+      <w:r>
+        <w:rPr>
+          <w:sz w:val="22"/>
+          <w:szCs w:val="22"/>
+        </w:rPr>
         <w:t xml:space="preserve">(Para manejo de ñ y </w:t>
       </w:r>
       <w:r>
@@ -985,83 +1083,8 @@
           <w:sz w:val="22"/>
           <w:szCs w:val="22"/>
         </w:rPr>
-        <w:t>E</w:t>
-      </w:r>
-      <w:r>
-        <w:rPr>
-          <w:sz w:val="22"/>
-          <w:szCs w:val="22"/>
-        </w:rPr>
-        <w:t>spañol</w:t>
-      </w:r>
-    </w:p>
-    <w:p>
-      <w:pPr>
-        <w:spacing w:after="0"/>
-        <w:ind w:left="708" w:firstLine="2"/>
-        <w:rPr>
-          <w:sz w:val="22"/>
-          <w:szCs w:val="22"/>
-        </w:rPr>
-      </w:pPr>
-    </w:p>
-    <w:p>
-      <w:pPr>
-        <w:spacing w:after="0"/>
-        <w:ind w:left="708" w:firstLine="2"/>
-        <w:rPr>
-          <w:sz w:val="22"/>
-          <w:szCs w:val="22"/>
-        </w:rPr>
-      </w:pPr>
-    </w:p>
-    <w:p>
-      <w:pPr>
-        <w:spacing w:after="0"/>
-        <w:ind w:left="708" w:firstLine="2"/>
-        <w:rPr>
-          <w:sz w:val="22"/>
-          <w:szCs w:val="22"/>
-        </w:rPr>
-      </w:pPr>
-    </w:p>
-    <w:p>
-      <w:pPr>
-        <w:spacing w:after="0"/>
-        <w:ind w:left="708" w:firstLine="2"/>
-        <w:rPr>
-          <w:sz w:val="22"/>
-          <w:szCs w:val="22"/>
-        </w:rPr>
-      </w:pPr>
-    </w:p>
-    <w:p>
-      <w:pPr>
-        <w:spacing w:after="0"/>
-        <w:rPr>
-          <w:sz w:val="22"/>
-          <w:szCs w:val="22"/>
-        </w:rPr>
-      </w:pPr>
-    </w:p>
-    <w:p>
-      <w:pPr>
-        <w:spacing w:after="0"/>
-        <w:rPr>
-          <w:sz w:val="22"/>
-          <w:szCs w:val="22"/>
-        </w:rPr>
-      </w:pPr>
-    </w:p>
-    <w:p>
-      <w:pPr>
-        <w:spacing w:after="0"/>
-        <w:ind w:left="708" w:firstLine="2"/>
-        <w:rPr>
-          <w:sz w:val="22"/>
-          <w:szCs w:val="22"/>
-        </w:rPr>
-      </w:pPr>
+        <w:t>español</w:t>
+      </w:r>
     </w:p>
     <w:p>
       <w:pPr>
@@ -1123,7 +1146,7 @@
           <w:lang w:val="en-US"/>
         </w:rPr>
         <w:drawing>
-          <wp:anchor distT="0" distB="0" distL="114300" distR="114300" simplePos="0" relativeHeight="251659264" behindDoc="0" locked="0" layoutInCell="1" allowOverlap="1" wp14:anchorId="6AE8595F" wp14:editId="01203B3D">
+          <wp:anchor distT="0" distB="0" distL="114300" distR="114300" simplePos="0" relativeHeight="251658241" behindDoc="0" locked="0" layoutInCell="1" allowOverlap="1" wp14:anchorId="6AE8595F" wp14:editId="3E35DBE4">
             <wp:simplePos x="0" y="0"/>
             <wp:positionH relativeFrom="margin">
               <wp:posOffset>899549</wp:posOffset>
@@ -1132,7 +1155,7 @@
               <wp:posOffset>14605</wp:posOffset>
             </wp:positionV>
             <wp:extent cx="4493580" cy="567813"/>
-            <wp:effectExtent l="0" t="0" r="2540" b="3810"/>
+            <wp:effectExtent l="19050" t="19050" r="21590" b="22860"/>
             <wp:wrapNone/>
             <wp:docPr id="755064256" name="Imagen 1"/>
             <wp:cNvGraphicFramePr>
@@ -1165,6 +1188,11 @@
                     <a:prstGeom prst="rect">
                       <a:avLst/>
                     </a:prstGeom>
+                    <a:ln>
+                      <a:solidFill>
+                        <a:schemeClr val="accent1"/>
+                      </a:solidFill>
+                    </a:ln>
                   </pic:spPr>
                 </pic:pic>
               </a:graphicData>
@@ -1266,20 +1294,58 @@
       </w:pPr>
       <w:r>
         <w:rPr>
+          <w:sz w:val="22"/>
+          <w:szCs w:val="22"/>
+        </w:rPr>
+        <w:t xml:space="preserve"> </w:t>
+      </w:r>
+      <w:r>
+        <w:rPr>
+          <w:sz w:val="22"/>
+          <w:szCs w:val="22"/>
+        </w:rPr>
+        <w:tab/>
+      </w:r>
+      <w:r>
+        <w:rPr>
+          <w:sz w:val="22"/>
+          <w:szCs w:val="22"/>
+        </w:rPr>
+        <w:tab/>
+        <w:t xml:space="preserve">--Datos iniciales del </w:t>
+      </w:r>
+      <w:r>
+        <w:rPr>
+          <w:sz w:val="22"/>
+          <w:szCs w:val="22"/>
+        </w:rPr>
+        <w:t>catálogo</w:t>
+      </w:r>
+      <w:r>
+        <w:rPr>
+          <w:sz w:val="22"/>
+          <w:szCs w:val="22"/>
+        </w:rPr>
+        <w:t xml:space="preserve"> de Roles</w:t>
+      </w:r>
+    </w:p>
+    <w:p>
+      <w:r>
+        <w:rPr>
           <w:noProof/>
           <w:lang w:val="en-US"/>
         </w:rPr>
         <w:drawing>
-          <wp:anchor distT="0" distB="0" distL="114300" distR="114300" simplePos="0" relativeHeight="251660288" behindDoc="0" locked="0" layoutInCell="1" allowOverlap="1" wp14:anchorId="5FF56CC7" wp14:editId="472147E9">
+          <wp:anchor distT="0" distB="0" distL="114300" distR="114300" simplePos="0" relativeHeight="251658242" behindDoc="0" locked="0" layoutInCell="1" allowOverlap="1" wp14:anchorId="5FF56CC7" wp14:editId="7654D295">
             <wp:simplePos x="0" y="0"/>
             <wp:positionH relativeFrom="column">
-              <wp:posOffset>920750</wp:posOffset>
+              <wp:posOffset>836246</wp:posOffset>
             </wp:positionH>
             <wp:positionV relativeFrom="paragraph">
-              <wp:posOffset>270869</wp:posOffset>
+              <wp:posOffset>14947</wp:posOffset>
             </wp:positionV>
-            <wp:extent cx="2332383" cy="789868"/>
-            <wp:effectExtent l="0" t="0" r="0" b="0"/>
+            <wp:extent cx="2330721" cy="1195754"/>
+            <wp:effectExtent l="19050" t="19050" r="12700" b="23495"/>
             <wp:wrapNone/>
             <wp:docPr id="905063245" name="Imagen 1"/>
             <wp:cNvGraphicFramePr>
@@ -1307,11 +1373,16 @@
                   <pic:spPr>
                     <a:xfrm>
                       <a:off x="0" y="0"/>
-                      <a:ext cx="2332383" cy="789868"/>
+                      <a:ext cx="2330721" cy="1195754"/>
                     </a:xfrm>
                     <a:prstGeom prst="rect">
                       <a:avLst/>
                     </a:prstGeom>
+                    <a:ln>
+                      <a:solidFill>
+                        <a:schemeClr val="accent1"/>
+                      </a:solidFill>
+                    </a:ln>
                   </pic:spPr>
                 </pic:pic>
               </a:graphicData>
@@ -1327,60 +1398,20 @@
       </w:r>
       <w:r>
         <w:rPr>
-          <w:sz w:val="22"/>
-          <w:szCs w:val="22"/>
-        </w:rPr>
-        <w:t xml:space="preserve"> </w:t>
-      </w:r>
-      <w:r>
-        <w:rPr>
-          <w:sz w:val="22"/>
-          <w:szCs w:val="22"/>
-        </w:rPr>
-        <w:tab/>
-      </w:r>
-      <w:r>
-        <w:rPr>
-          <w:sz w:val="22"/>
-          <w:szCs w:val="22"/>
-        </w:rPr>
-        <w:tab/>
-        <w:t xml:space="preserve">--Datos iniciales del </w:t>
-      </w:r>
-      <w:r>
-        <w:rPr>
-          <w:sz w:val="22"/>
-          <w:szCs w:val="22"/>
-        </w:rPr>
-        <w:t>catálogo</w:t>
-      </w:r>
-      <w:r>
-        <w:rPr>
-          <w:sz w:val="22"/>
-          <w:szCs w:val="22"/>
-        </w:rPr>
-        <w:t xml:space="preserve"> de Roles</w:t>
-      </w:r>
-    </w:p>
-    <w:p/>
-    <w:p/>
-    <w:p>
-      <w:r>
-        <w:rPr>
           <w:noProof/>
           <w:lang w:val="en-US"/>
         </w:rPr>
         <w:drawing>
-          <wp:anchor distT="0" distB="0" distL="114300" distR="114300" simplePos="0" relativeHeight="251661312" behindDoc="0" locked="0" layoutInCell="1" allowOverlap="1" wp14:anchorId="0CF4DCED" wp14:editId="4A19666A">
+          <wp:anchor distT="0" distB="0" distL="114300" distR="114300" simplePos="0" relativeHeight="251658243" behindDoc="0" locked="0" layoutInCell="1" allowOverlap="1" wp14:anchorId="0CF4DCED" wp14:editId="6C52EBE2">
             <wp:simplePos x="0" y="0"/>
             <wp:positionH relativeFrom="margin">
-              <wp:posOffset>914400</wp:posOffset>
+              <wp:posOffset>3277137</wp:posOffset>
             </wp:positionH>
             <wp:positionV relativeFrom="paragraph">
-              <wp:posOffset>223244</wp:posOffset>
+              <wp:posOffset>28917</wp:posOffset>
             </wp:positionV>
-            <wp:extent cx="2385060" cy="918845"/>
-            <wp:effectExtent l="0" t="0" r="0" b="0"/>
+            <wp:extent cx="2385060" cy="1188720"/>
+            <wp:effectExtent l="19050" t="19050" r="15240" b="11430"/>
             <wp:wrapNone/>
             <wp:docPr id="1739926288" name="Imagen 1"/>
             <wp:cNvGraphicFramePr>
@@ -1408,11 +1439,16 @@
                   <pic:spPr>
                     <a:xfrm>
                       <a:off x="0" y="0"/>
-                      <a:ext cx="2385060" cy="918845"/>
+                      <a:ext cx="2385060" cy="1188720"/>
                     </a:xfrm>
                     <a:prstGeom prst="rect">
                       <a:avLst/>
                     </a:prstGeom>
+                    <a:ln>
+                      <a:solidFill>
+                        <a:schemeClr val="accent1"/>
+                      </a:solidFill>
+                    </a:ln>
                   </pic:spPr>
                 </pic:pic>
               </a:graphicData>
@@ -1427,6 +1463,8 @@
         </w:drawing>
       </w:r>
     </w:p>
+    <w:p/>
+    <w:p/>
     <w:p>
       <w:r>
         <w:t xml:space="preserve"> </w:t>
@@ -1438,8 +1476,14 @@
         <w:tab/>
       </w:r>
     </w:p>
-    <w:p/>
-    <w:p/>
+    <w:p>
+      <w:pPr>
+        <w:rPr>
+          <w:sz w:val="4"/>
+          <w:szCs w:val="4"/>
+        </w:rPr>
+      </w:pPr>
+    </w:p>
     <w:p>
       <w:pPr>
         <w:pStyle w:val="Prrafodelista"/>
@@ -1457,7 +1501,7 @@
           <w:noProof/>
         </w:rPr>
         <w:drawing>
-          <wp:anchor distT="0" distB="0" distL="114300" distR="114300" simplePos="0" relativeHeight="251662336" behindDoc="0" locked="0" layoutInCell="1" allowOverlap="1" wp14:anchorId="4CAE4431" wp14:editId="403EDFEC">
+          <wp:anchor distT="0" distB="0" distL="114300" distR="114300" simplePos="0" relativeHeight="251658244" behindDoc="0" locked="0" layoutInCell="1" allowOverlap="1" wp14:anchorId="4CAE4431" wp14:editId="092B94EE">
             <wp:simplePos x="0" y="0"/>
             <wp:positionH relativeFrom="column">
               <wp:posOffset>894522</wp:posOffset>
@@ -1466,7 +1510,7 @@
               <wp:posOffset>283239</wp:posOffset>
             </wp:positionV>
             <wp:extent cx="2484782" cy="1521944"/>
-            <wp:effectExtent l="0" t="0" r="0" b="2540"/>
+            <wp:effectExtent l="19050" t="19050" r="10795" b="21590"/>
             <wp:wrapNone/>
             <wp:docPr id="496991269" name="Imagen 1"/>
             <wp:cNvGraphicFramePr>
@@ -1499,6 +1543,11 @@
                     <a:prstGeom prst="rect">
                       <a:avLst/>
                     </a:prstGeom>
+                    <a:ln>
+                      <a:solidFill>
+                        <a:schemeClr val="accent1"/>
+                      </a:solidFill>
+                    </a:ln>
                   </pic:spPr>
                 </pic:pic>
               </a:graphicData>
@@ -1555,35 +1604,28 @@
     </w:p>
     <w:p>
       <w:pPr>
-        <w:pStyle w:val="Prrafodelista"/>
-        <w:numPr>
-          <w:ilvl w:val="0"/>
-          <w:numId w:val="2"/>
-        </w:numPr>
-        <w:rPr>
-          <w:b/>
-          <w:bCs/>
-        </w:rPr>
-      </w:pPr>
-      <w:r>
-        <w:rPr>
-          <w:b/>
-          <w:bCs/>
+        <w:rPr>
+          <w:b/>
+          <w:bCs/>
+        </w:rPr>
+      </w:pPr>
+      <w:r>
+        <w:rPr>
           <w:noProof/>
         </w:rPr>
         <w:drawing>
-          <wp:anchor distT="0" distB="0" distL="114300" distR="114300" simplePos="0" relativeHeight="251663360" behindDoc="0" locked="0" layoutInCell="1" allowOverlap="1" wp14:anchorId="741BF76A" wp14:editId="0E5300F6">
+          <wp:anchor distT="0" distB="0" distL="114300" distR="114300" simplePos="0" relativeHeight="251658264" behindDoc="0" locked="0" layoutInCell="1" allowOverlap="1" wp14:anchorId="745B81C3" wp14:editId="26DC6DE8">
             <wp:simplePos x="0" y="0"/>
             <wp:positionH relativeFrom="margin">
-              <wp:posOffset>876054</wp:posOffset>
+              <wp:posOffset>909513</wp:posOffset>
             </wp:positionH>
             <wp:positionV relativeFrom="paragraph">
-              <wp:posOffset>265430</wp:posOffset>
+              <wp:posOffset>289343</wp:posOffset>
             </wp:positionV>
-            <wp:extent cx="4958242" cy="921774"/>
-            <wp:effectExtent l="0" t="0" r="0" b="0"/>
+            <wp:extent cx="4247909" cy="521970"/>
+            <wp:effectExtent l="0" t="0" r="635" b="0"/>
             <wp:wrapNone/>
-            <wp:docPr id="308960486" name="Imagen 1"/>
+            <wp:docPr id="1511269124" name="Imagen 1"/>
             <wp:cNvGraphicFramePr>
               <a:graphicFrameLocks xmlns:a="http://schemas.openxmlformats.org/drawingml/2006/main" noChangeAspect="1"/>
             </wp:cNvGraphicFramePr>
@@ -1591,7 +1633,7 @@
               <a:graphicData uri="http://schemas.openxmlformats.org/drawingml/2006/picture">
                 <pic:pic xmlns:pic="http://schemas.openxmlformats.org/drawingml/2006/picture">
                   <pic:nvPicPr>
-                    <pic:cNvPr id="308960486" name=""/>
+                    <pic:cNvPr id="1511269124" name=""/>
                     <pic:cNvPicPr/>
                   </pic:nvPicPr>
                   <pic:blipFill>
@@ -1609,7 +1651,7 @@
                   <pic:spPr>
                     <a:xfrm>
                       <a:off x="0" y="0"/>
-                      <a:ext cx="4958242" cy="921774"/>
+                      <a:ext cx="4247909" cy="521970"/>
                     </a:xfrm>
                     <a:prstGeom prst="rect">
                       <a:avLst/>
@@ -1628,30 +1670,166 @@
         </w:drawing>
       </w:r>
       <w:r>
-        <w:rPr>
-          <w:b/>
-          <w:bCs/>
-        </w:rPr>
-        <w:t xml:space="preserve">Carreras </w:t>
-      </w:r>
-      <w:r>
-        <w:rPr>
-          <w:b/>
-          <w:bCs/>
-        </w:rPr>
-        <w:t xml:space="preserve"> --</w:t>
-      </w:r>
-      <w:r>
-        <w:rPr>
-          <w:b/>
-          <w:bCs/>
-        </w:rPr>
-        <w:t xml:space="preserve"> Guarda todas las carreras de la Institución</w:t>
-      </w:r>
-    </w:p>
-    <w:p/>
-    <w:p/>
-    <w:p/>
+        <w:t xml:space="preserve"> </w:t>
+      </w:r>
+      <w:r>
+        <w:tab/>
+      </w:r>
+      <w:r>
+        <w:tab/>
+        <w:t xml:space="preserve">Cambio en el campo </w:t>
+      </w:r>
+      <w:r>
+        <w:rPr>
+          <w:b/>
+          <w:bCs/>
+        </w:rPr>
+        <w:t xml:space="preserve">Email </w:t>
+      </w:r>
+      <w:r>
+        <w:rPr>
+          <w:b/>
+          <w:bCs/>
+        </w:rPr>
+        <w:t xml:space="preserve">NOT NULL </w:t>
+      </w:r>
+      <w:r>
+        <w:t xml:space="preserve">por </w:t>
+      </w:r>
+      <w:r>
+        <w:rPr>
+          <w:b/>
+          <w:bCs/>
+        </w:rPr>
+        <w:t xml:space="preserve">Email </w:t>
+      </w:r>
+      <w:r>
+        <w:rPr>
+          <w:b/>
+          <w:bCs/>
+        </w:rPr>
+        <w:t>DEFAULT NULL</w:t>
+      </w:r>
+    </w:p>
+    <w:p>
+      <w:pPr>
+        <w:rPr>
+          <w:b/>
+          <w:bCs/>
+        </w:rPr>
+      </w:pPr>
+    </w:p>
+    <w:p/>
+    <w:p>
+      <w:pPr>
+        <w:rPr>
+          <w:ins w:id="0" w:author="Microsoft Word" w:date="2026-06-10T12:26:00Z" w16du:dateUtc="2026-06-10T18:26:00Z"/>
+        </w:rPr>
+      </w:pPr>
+      <w:r>
+        <w:rPr>
+          <w:noProof/>
+        </w:rPr>
+        <w:drawing>
+          <wp:anchor distT="0" distB="0" distL="114300" distR="114300" simplePos="0" relativeHeight="251658267" behindDoc="0" locked="0" layoutInCell="1" allowOverlap="1" wp14:anchorId="60541BC0" wp14:editId="6B74BCC7">
+            <wp:simplePos x="0" y="0"/>
+            <wp:positionH relativeFrom="margin">
+              <wp:posOffset>1773344</wp:posOffset>
+            </wp:positionH>
+            <wp:positionV relativeFrom="paragraph">
+              <wp:posOffset>576791</wp:posOffset>
+            </wp:positionV>
+            <wp:extent cx="3691467" cy="584787"/>
+            <wp:effectExtent l="0" t="0" r="4445" b="6350"/>
+            <wp:wrapNone/>
+            <wp:docPr id="2138943239" name="Imagen 1"/>
+            <wp:cNvGraphicFramePr>
+              <a:graphicFrameLocks xmlns:a="http://schemas.openxmlformats.org/drawingml/2006/main" noChangeAspect="1"/>
+            </wp:cNvGraphicFramePr>
+            <a:graphic xmlns:a="http://schemas.openxmlformats.org/drawingml/2006/main">
+              <a:graphicData uri="http://schemas.openxmlformats.org/drawingml/2006/picture">
+                <pic:pic xmlns:pic="http://schemas.openxmlformats.org/drawingml/2006/picture">
+                  <pic:nvPicPr>
+                    <pic:cNvPr id="2138943239" name=""/>
+                    <pic:cNvPicPr/>
+                  </pic:nvPicPr>
+                  <pic:blipFill>
+                    <a:blip r:embed="rId12">
+                      <a:extLst>
+                        <a:ext uri="{28A0092B-C50C-407E-A947-70E740481C1C}">
+                          <a14:useLocalDpi xmlns:a14="http://schemas.microsoft.com/office/drawing/2010/main" val="0"/>
+                        </a:ext>
+                      </a:extLst>
+                    </a:blip>
+                    <a:stretch>
+                      <a:fillRect/>
+                    </a:stretch>
+                  </pic:blipFill>
+                  <pic:spPr>
+                    <a:xfrm>
+                      <a:off x="0" y="0"/>
+                      <a:ext cx="3691467" cy="584787"/>
+                    </a:xfrm>
+                    <a:prstGeom prst="rect">
+                      <a:avLst/>
+                    </a:prstGeom>
+                  </pic:spPr>
+                </pic:pic>
+              </a:graphicData>
+            </a:graphic>
+            <wp14:sizeRelH relativeFrom="margin">
+              <wp14:pctWidth>0</wp14:pctWidth>
+            </wp14:sizeRelH>
+            <wp14:sizeRelV relativeFrom="margin">
+              <wp14:pctHeight>0</wp14:pctHeight>
+            </wp14:sizeRelV>
+          </wp:anchor>
+        </w:drawing>
+      </w:r>
+      <w:ins w:id="1" w:author="Microsoft Word" w:date="2026-06-10T12:26:00Z" w16du:dateUtc="2026-06-10T18:26:00Z">
+        <w:r>
+          <w:t xml:space="preserve"> </w:t>
+        </w:r>
+        <w:r>
+          <w:tab/>
+        </w:r>
+        <w:r>
+          <w:tab/>
+          <w:t xml:space="preserve">Agregamos </w:t>
+        </w:r>
+        <w:r>
+          <w:t xml:space="preserve">el campo de Teléfono en la tabla de Usuarios para que al  </w:t>
+        </w:r>
+        <w:r>
+          <w:tab/>
+        </w:r>
+        <w:r>
+          <w:tab/>
+          <w:t xml:space="preserve">momento de registrar </w:t>
+        </w:r>
+        <w:r>
+          <w:t xml:space="preserve">un Docente o Tutor tengamos a la vista la forma de  </w:t>
+        </w:r>
+        <w:r>
+          <w:tab/>
+          <w:t xml:space="preserve"> </w:t>
+        </w:r>
+        <w:r>
+          <w:tab/>
+          <w:t>contactarlo.</w:t>
+        </w:r>
+        <w:r>
+          <w:br/>
+        </w:r>
+      </w:ins>
+    </w:p>
+    <w:p>
+      <w:pPr>
+        <w:rPr>
+          <w:ins w:id="2" w:author="Microsoft Word" w:date="2026-06-10T12:26:00Z" w16du:dateUtc="2026-06-10T18:26:00Z"/>
+        </w:rPr>
+      </w:pPr>
+    </w:p>
     <w:p>
       <w:pPr>
         <w:pStyle w:val="Prrafodelista"/>
@@ -1668,10 +1846,155 @@
         <w:rPr>
           <w:b/>
           <w:bCs/>
+        </w:rPr>
+        <w:t xml:space="preserve">Carreras </w:t>
+      </w:r>
+      <w:r>
+        <w:rPr>
+          <w:b/>
+          <w:bCs/>
+        </w:rPr>
+        <w:t xml:space="preserve"> --</w:t>
+      </w:r>
+      <w:r>
+        <w:rPr>
+          <w:b/>
+          <w:bCs/>
+        </w:rPr>
+        <w:t xml:space="preserve"> Guarda todas las carreras de la Institución</w:t>
+      </w:r>
+    </w:p>
+    <w:p>
+      <w:r>
+        <w:rPr>
+          <w:b/>
+          <w:bCs/>
           <w:noProof/>
         </w:rPr>
         <w:drawing>
-          <wp:anchor distT="0" distB="0" distL="114300" distR="114300" simplePos="0" relativeHeight="251664384" behindDoc="0" locked="0" layoutInCell="1" allowOverlap="1" wp14:anchorId="54011DA1" wp14:editId="0A91969F">
+          <wp:anchor distT="0" distB="0" distL="114300" distR="114300" simplePos="0" relativeHeight="251658245" behindDoc="0" locked="0" layoutInCell="1" allowOverlap="1" wp14:anchorId="741BF76A" wp14:editId="7F1D9A00">
+            <wp:simplePos x="0" y="0"/>
+            <wp:positionH relativeFrom="margin">
+              <wp:posOffset>896620</wp:posOffset>
+            </wp:positionH>
+            <wp:positionV relativeFrom="paragraph">
+              <wp:posOffset>7620</wp:posOffset>
+            </wp:positionV>
+            <wp:extent cx="4958080" cy="921385"/>
+            <wp:effectExtent l="19050" t="19050" r="13970" b="12065"/>
+            <wp:wrapNone/>
+            <wp:docPr id="308960486" name="Imagen 1"/>
+            <wp:cNvGraphicFramePr>
+              <a:graphicFrameLocks xmlns:a="http://schemas.openxmlformats.org/drawingml/2006/main" noChangeAspect="1"/>
+            </wp:cNvGraphicFramePr>
+            <a:graphic xmlns:a="http://schemas.openxmlformats.org/drawingml/2006/main">
+              <a:graphicData uri="http://schemas.openxmlformats.org/drawingml/2006/picture">
+                <pic:pic xmlns:pic="http://schemas.openxmlformats.org/drawingml/2006/picture">
+                  <pic:nvPicPr>
+                    <pic:cNvPr id="308960486" name=""/>
+                    <pic:cNvPicPr/>
+                  </pic:nvPicPr>
+                  <pic:blipFill>
+                    <a:blip r:embed="rId13">
+                      <a:extLst>
+                        <a:ext uri="{28A0092B-C50C-407E-A947-70E740481C1C}">
+                          <a14:useLocalDpi xmlns:a14="http://schemas.microsoft.com/office/drawing/2010/main" val="0"/>
+                        </a:ext>
+                      </a:extLst>
+                    </a:blip>
+                    <a:stretch>
+                      <a:fillRect/>
+                    </a:stretch>
+                  </pic:blipFill>
+                  <pic:spPr>
+                    <a:xfrm>
+                      <a:off x="0" y="0"/>
+                      <a:ext cx="4958080" cy="921385"/>
+                    </a:xfrm>
+                    <a:prstGeom prst="rect">
+                      <a:avLst/>
+                    </a:prstGeom>
+                    <a:ln>
+                      <a:solidFill>
+                        <a:schemeClr val="accent1"/>
+                      </a:solidFill>
+                    </a:ln>
+                  </pic:spPr>
+                </pic:pic>
+              </a:graphicData>
+            </a:graphic>
+            <wp14:sizeRelH relativeFrom="margin">
+              <wp14:pctWidth>0</wp14:pctWidth>
+            </wp14:sizeRelH>
+            <wp14:sizeRelV relativeFrom="margin">
+              <wp14:pctHeight>0</wp14:pctHeight>
+            </wp14:sizeRelV>
+          </wp:anchor>
+        </w:drawing>
+      </w:r>
+    </w:p>
+    <w:p/>
+    <w:p/>
+    <w:p>
+      <w:pPr>
+        <w:rPr>
+          <w:sz w:val="10"/>
+          <w:szCs w:val="10"/>
+        </w:rPr>
+      </w:pPr>
+    </w:p>
+    <w:p>
+      <w:pPr>
+        <w:rPr>
+          <w:sz w:val="10"/>
+          <w:szCs w:val="10"/>
+        </w:rPr>
+      </w:pPr>
+    </w:p>
+    <w:p>
+      <w:pPr>
+        <w:rPr>
+          <w:sz w:val="10"/>
+          <w:szCs w:val="10"/>
+        </w:rPr>
+      </w:pPr>
+    </w:p>
+    <w:p>
+      <w:pPr>
+        <w:rPr>
+          <w:sz w:val="10"/>
+          <w:szCs w:val="10"/>
+        </w:rPr>
+      </w:pPr>
+    </w:p>
+    <w:p>
+      <w:pPr>
+        <w:rPr>
+          <w:sz w:val="10"/>
+          <w:szCs w:val="10"/>
+        </w:rPr>
+      </w:pPr>
+    </w:p>
+    <w:p>
+      <w:pPr>
+        <w:pStyle w:val="Prrafodelista"/>
+        <w:numPr>
+          <w:ilvl w:val="0"/>
+          <w:numId w:val="2"/>
+        </w:numPr>
+        <w:rPr>
+          <w:b/>
+          <w:bCs/>
+        </w:rPr>
+      </w:pPr>
+      <w:r>
+        <w:rPr>
+          <w:b/>
+          <w:bCs/>
+          <w:noProof/>
+        </w:rPr>
+        <w:drawing>
+          <wp:anchor distT="0" distB="0" distL="114300" distR="114300" simplePos="0" relativeHeight="251658246" behindDoc="0" locked="0" layoutInCell="1" allowOverlap="1" wp14:anchorId="54011DA1" wp14:editId="4A7BD232">
             <wp:simplePos x="0" y="0"/>
             <wp:positionH relativeFrom="column">
               <wp:posOffset>861449</wp:posOffset>
@@ -1680,7 +2003,7 @@
               <wp:posOffset>267335</wp:posOffset>
             </wp:positionV>
             <wp:extent cx="4737652" cy="1646578"/>
-            <wp:effectExtent l="0" t="0" r="6350" b="0"/>
+            <wp:effectExtent l="19050" t="19050" r="25400" b="10795"/>
             <wp:wrapNone/>
             <wp:docPr id="233814042" name="Imagen 1"/>
             <wp:cNvGraphicFramePr>
@@ -1694,7 +2017,7 @@
                     <pic:cNvPicPr/>
                   </pic:nvPicPr>
                   <pic:blipFill>
-                    <a:blip r:embed="rId12">
+                    <a:blip r:embed="rId14">
                       <a:extLst>
                         <a:ext uri="{28A0092B-C50C-407E-A947-70E740481C1C}">
                           <a14:useLocalDpi xmlns:a14="http://schemas.microsoft.com/office/drawing/2010/main" val="0"/>
@@ -1713,6 +2036,11 @@
                     <a:prstGeom prst="rect">
                       <a:avLst/>
                     </a:prstGeom>
+                    <a:ln>
+                      <a:solidFill>
+                        <a:schemeClr val="accent1"/>
+                      </a:solidFill>
+                    </a:ln>
                   </pic:spPr>
                 </pic:pic>
               </a:graphicData>
@@ -1746,6 +2074,7 @@
     <w:p/>
     <w:p/>
     <w:p/>
+    <w:p/>
     <w:p>
       <w:pPr>
         <w:pStyle w:val="Prrafodelista"/>
@@ -1764,9 +2093,8 @@
           <w:bCs/>
           <w:noProof/>
         </w:rPr>
-        <w:lastRenderedPageBreak/>
         <w:drawing>
-          <wp:anchor distT="0" distB="0" distL="114300" distR="114300" simplePos="0" relativeHeight="251665408" behindDoc="0" locked="0" layoutInCell="1" allowOverlap="1" wp14:anchorId="5E9C82CF" wp14:editId="5AEC42BF">
+          <wp:anchor distT="0" distB="0" distL="114300" distR="114300" simplePos="0" relativeHeight="251658247" behindDoc="0" locked="0" layoutInCell="1" allowOverlap="1" wp14:anchorId="5E9C82CF" wp14:editId="0C43D533">
             <wp:simplePos x="0" y="0"/>
             <wp:positionH relativeFrom="column">
               <wp:posOffset>868434</wp:posOffset>
@@ -1775,7 +2103,7 @@
               <wp:posOffset>485775</wp:posOffset>
             </wp:positionV>
             <wp:extent cx="3591232" cy="1739441"/>
-            <wp:effectExtent l="0" t="0" r="0" b="0"/>
+            <wp:effectExtent l="19050" t="19050" r="9525" b="13335"/>
             <wp:wrapNone/>
             <wp:docPr id="143718852" name="Imagen 1"/>
             <wp:cNvGraphicFramePr>
@@ -1789,7 +2117,7 @@
                     <pic:cNvPicPr/>
                   </pic:nvPicPr>
                   <pic:blipFill>
-                    <a:blip r:embed="rId13">
+                    <a:blip r:embed="rId15">
                       <a:extLst>
                         <a:ext uri="{28A0092B-C50C-407E-A947-70E740481C1C}">
                           <a14:useLocalDpi xmlns:a14="http://schemas.microsoft.com/office/drawing/2010/main" val="0"/>
@@ -1808,6 +2136,11 @@
                     <a:prstGeom prst="rect">
                       <a:avLst/>
                     </a:prstGeom>
+                    <a:ln>
+                      <a:solidFill>
+                        <a:schemeClr val="accent1"/>
+                      </a:solidFill>
+                    </a:ln>
                   </pic:spPr>
                 </pic:pic>
               </a:graphicData>
@@ -1855,6 +2188,100 @@
     <w:p/>
     <w:p/>
     <w:p/>
+    <w:p/>
+    <w:p>
+      <w:pPr>
+        <w:ind w:left="1416" w:firstLine="4"/>
+      </w:pPr>
+      <w:r>
+        <w:rPr>
+          <w:noProof/>
+        </w:rPr>
+        <w:drawing>
+          <wp:anchor distT="0" distB="0" distL="114300" distR="114300" simplePos="0" relativeHeight="251658260" behindDoc="0" locked="0" layoutInCell="1" allowOverlap="1" wp14:anchorId="15A728C0" wp14:editId="428C1C7D">
+            <wp:simplePos x="0" y="0"/>
+            <wp:positionH relativeFrom="column">
+              <wp:posOffset>885093</wp:posOffset>
+            </wp:positionH>
+            <wp:positionV relativeFrom="paragraph">
+              <wp:posOffset>483235</wp:posOffset>
+            </wp:positionV>
+            <wp:extent cx="4108450" cy="762426"/>
+            <wp:effectExtent l="19050" t="19050" r="25400" b="19050"/>
+            <wp:wrapNone/>
+            <wp:docPr id="1058623106" name="Imagen 1"/>
+            <wp:cNvGraphicFramePr>
+              <a:graphicFrameLocks xmlns:a="http://schemas.openxmlformats.org/drawingml/2006/main" noChangeAspect="1"/>
+            </wp:cNvGraphicFramePr>
+            <a:graphic xmlns:a="http://schemas.openxmlformats.org/drawingml/2006/main">
+              <a:graphicData uri="http://schemas.openxmlformats.org/drawingml/2006/picture">
+                <pic:pic xmlns:pic="http://schemas.openxmlformats.org/drawingml/2006/picture">
+                  <pic:nvPicPr>
+                    <pic:cNvPr id="1058623106" name=""/>
+                    <pic:cNvPicPr/>
+                  </pic:nvPicPr>
+                  <pic:blipFill>
+                    <a:blip r:embed="rId16">
+                      <a:extLst>
+                        <a:ext uri="{28A0092B-C50C-407E-A947-70E740481C1C}">
+                          <a14:useLocalDpi xmlns:a14="http://schemas.microsoft.com/office/drawing/2010/main" val="0"/>
+                        </a:ext>
+                      </a:extLst>
+                    </a:blip>
+                    <a:stretch>
+                      <a:fillRect/>
+                    </a:stretch>
+                  </pic:blipFill>
+                  <pic:spPr>
+                    <a:xfrm>
+                      <a:off x="0" y="0"/>
+                      <a:ext cx="4108450" cy="762426"/>
+                    </a:xfrm>
+                    <a:prstGeom prst="rect">
+                      <a:avLst/>
+                    </a:prstGeom>
+                    <a:ln>
+                      <a:solidFill>
+                        <a:schemeClr val="accent1"/>
+                      </a:solidFill>
+                    </a:ln>
+                  </pic:spPr>
+                </pic:pic>
+              </a:graphicData>
+            </a:graphic>
+            <wp14:sizeRelH relativeFrom="margin">
+              <wp14:pctWidth>0</wp14:pctWidth>
+            </wp14:sizeRelH>
+            <wp14:sizeRelV relativeFrom="margin">
+              <wp14:pctHeight>0</wp14:pctHeight>
+            </wp14:sizeRelV>
+          </wp:anchor>
+        </w:drawing>
+      </w:r>
+      <w:r>
+        <w:t xml:space="preserve">Cambio en la Tabla alumnos agregando el campo </w:t>
+      </w:r>
+      <w:r>
+        <w:rPr>
+          <w:b/>
+          <w:bCs/>
+        </w:rPr>
+        <w:t xml:space="preserve">Id_Usuario </w:t>
+      </w:r>
+      <w:r>
+        <w:t>para inicio              de sesión de los alumnos por medio de su respectiva matricula</w:t>
+      </w:r>
+    </w:p>
+    <w:p>
+      <w:pPr>
+        <w:ind w:left="1416" w:firstLine="4"/>
+      </w:pPr>
+    </w:p>
+    <w:p>
+      <w:pPr>
+        <w:ind w:left="1416" w:firstLine="4"/>
+      </w:pPr>
+    </w:p>
     <w:p>
       <w:pPr>
         <w:rPr>
@@ -1880,7 +2307,7 @@
           <w:noProof/>
         </w:rPr>
         <w:drawing>
-          <wp:anchor distT="0" distB="0" distL="114300" distR="114300" simplePos="0" relativeHeight="251666432" behindDoc="0" locked="0" layoutInCell="1" allowOverlap="1" wp14:anchorId="4FEEA690" wp14:editId="4BFBC754">
+          <wp:anchor distT="0" distB="0" distL="114300" distR="114300" simplePos="0" relativeHeight="251658248" behindDoc="0" locked="0" layoutInCell="1" allowOverlap="1" wp14:anchorId="4FEEA690" wp14:editId="5AB313AE">
             <wp:simplePos x="0" y="0"/>
             <wp:positionH relativeFrom="margin">
               <wp:posOffset>862781</wp:posOffset>
@@ -1889,7 +2316,7 @@
               <wp:posOffset>268687</wp:posOffset>
             </wp:positionV>
             <wp:extent cx="4439264" cy="1887153"/>
-            <wp:effectExtent l="0" t="0" r="0" b="0"/>
+            <wp:effectExtent l="19050" t="19050" r="19050" b="18415"/>
             <wp:wrapNone/>
             <wp:docPr id="1414633608" name="Imagen 1"/>
             <wp:cNvGraphicFramePr>
@@ -1903,7 +2330,7 @@
                     <pic:cNvPicPr/>
                   </pic:nvPicPr>
                   <pic:blipFill>
-                    <a:blip r:embed="rId14">
+                    <a:blip r:embed="rId17">
                       <a:extLst>
                         <a:ext uri="{28A0092B-C50C-407E-A947-70E740481C1C}">
                           <a14:useLocalDpi xmlns:a14="http://schemas.microsoft.com/office/drawing/2010/main" val="0"/>
@@ -1922,6 +2349,11 @@
                     <a:prstGeom prst="rect">
                       <a:avLst/>
                     </a:prstGeom>
+                    <a:ln>
+                      <a:solidFill>
+                        <a:schemeClr val="accent1"/>
+                      </a:solidFill>
+                    </a:ln>
                   </pic:spPr>
                 </pic:pic>
               </a:graphicData>
@@ -1970,43 +2402,134 @@
           <w:ilvl w:val="0"/>
           <w:numId w:val="2"/>
         </w:numPr>
-        <w:rPr>
-          <w:b/>
-          <w:bCs/>
-        </w:rPr>
-      </w:pPr>
-      <w:r>
-        <w:rPr>
-          <w:b/>
-          <w:bCs/>
-        </w:rPr>
-        <w:t>Importaciones -- Registra cada vez que se sube un archivo TACA al sistema.</w:t>
-      </w:r>
-    </w:p>
-    <w:p>
-      <w:pPr>
-        <w:pStyle w:val="Prrafodelista"/>
-        <w:ind w:left="1353"/>
-        <w:rPr>
-          <w:b/>
-          <w:bCs/>
-        </w:rPr>
       </w:pPr>
       <w:r>
         <w:rPr>
           <w:noProof/>
         </w:rPr>
         <w:drawing>
-          <wp:anchor distT="0" distB="0" distL="114300" distR="114300" simplePos="0" relativeHeight="251667456" behindDoc="0" locked="0" layoutInCell="1" allowOverlap="1" wp14:anchorId="6101E863" wp14:editId="3032961B">
+          <wp:anchor distT="0" distB="0" distL="114300" distR="114300" simplePos="0" relativeHeight="251658261" behindDoc="0" locked="0" layoutInCell="1" allowOverlap="1" wp14:anchorId="36CB0DE5" wp14:editId="3A56019E">
             <wp:simplePos x="0" y="0"/>
             <wp:positionH relativeFrom="column">
-              <wp:posOffset>833285</wp:posOffset>
+              <wp:posOffset>794825</wp:posOffset>
             </wp:positionH>
             <wp:positionV relativeFrom="paragraph">
-              <wp:posOffset>267336</wp:posOffset>
+              <wp:posOffset>290293</wp:posOffset>
             </wp:positionV>
-            <wp:extent cx="5021826" cy="2490328"/>
-            <wp:effectExtent l="0" t="0" r="7620" b="5715"/>
+            <wp:extent cx="5067250" cy="1012874"/>
+            <wp:effectExtent l="19050" t="19050" r="19685" b="15875"/>
+            <wp:wrapNone/>
+            <wp:docPr id="1367869248" name="Imagen 1"/>
+            <wp:cNvGraphicFramePr>
+              <a:graphicFrameLocks xmlns:a="http://schemas.openxmlformats.org/drawingml/2006/main" noChangeAspect="1"/>
+            </wp:cNvGraphicFramePr>
+            <a:graphic xmlns:a="http://schemas.openxmlformats.org/drawingml/2006/main">
+              <a:graphicData uri="http://schemas.openxmlformats.org/drawingml/2006/picture">
+                <pic:pic xmlns:pic="http://schemas.openxmlformats.org/drawingml/2006/picture">
+                  <pic:nvPicPr>
+                    <pic:cNvPr id="1367869248" name=""/>
+                    <pic:cNvPicPr/>
+                  </pic:nvPicPr>
+                  <pic:blipFill>
+                    <a:blip r:embed="rId18">
+                      <a:extLst>
+                        <a:ext uri="{28A0092B-C50C-407E-A947-70E740481C1C}">
+                          <a14:useLocalDpi xmlns:a14="http://schemas.microsoft.com/office/drawing/2010/main" val="0"/>
+                        </a:ext>
+                      </a:extLst>
+                    </a:blip>
+                    <a:stretch>
+                      <a:fillRect/>
+                    </a:stretch>
+                  </pic:blipFill>
+                  <pic:spPr>
+                    <a:xfrm>
+                      <a:off x="0" y="0"/>
+                      <a:ext cx="5072508" cy="1013925"/>
+                    </a:xfrm>
+                    <a:prstGeom prst="rect">
+                      <a:avLst/>
+                    </a:prstGeom>
+                    <a:ln>
+                      <a:solidFill>
+                        <a:schemeClr val="accent1"/>
+                      </a:solidFill>
+                    </a:ln>
+                  </pic:spPr>
+                </pic:pic>
+              </a:graphicData>
+            </a:graphic>
+            <wp14:sizeRelH relativeFrom="margin">
+              <wp14:pctWidth>0</wp14:pctWidth>
+            </wp14:sizeRelH>
+            <wp14:sizeRelV relativeFrom="margin">
+              <wp14:pctHeight>0</wp14:pctHeight>
+            </wp14:sizeRelV>
+          </wp:anchor>
+        </w:drawing>
+      </w:r>
+      <w:r>
+        <w:rPr>
+          <w:b/>
+          <w:bCs/>
+        </w:rPr>
+        <w:t xml:space="preserve">Aulas – Registra todas las aulas que están presentes en la Institución </w:t>
+      </w:r>
+    </w:p>
+    <w:p/>
+    <w:p>
+      <w:pPr>
+        <w:pStyle w:val="Prrafodelista"/>
+        <w:numPr>
+          <w:ilvl w:val="0"/>
+          <w:numId w:val="2"/>
+        </w:numPr>
+        <w:rPr>
+          <w:b/>
+          <w:bCs/>
+        </w:rPr>
+      </w:pPr>
+      <w:r>
+        <w:rPr>
+          <w:b/>
+          <w:bCs/>
+        </w:rPr>
+        <w:t>Importaciones -- Registra cada vez que se sube un archivo TACA al sistema.</w:t>
+      </w:r>
+    </w:p>
+    <w:p>
+      <w:pPr>
+        <w:pStyle w:val="Prrafodelista"/>
+        <w:ind w:left="1353"/>
+        <w:rPr>
+          <w:b/>
+          <w:bCs/>
+        </w:rPr>
+      </w:pPr>
+      <w:r>
+        <w:rPr>
+          <w:b/>
+          <w:bCs/>
+        </w:rPr>
+        <w:t>Sirve para saber quién subió qué, cuándo y para qué grupo</w:t>
+      </w:r>
+    </w:p>
+    <w:p>
+      <w:r>
+        <w:rPr>
+          <w:noProof/>
+        </w:rPr>
+        <w:drawing>
+          <wp:anchor distT="0" distB="0" distL="114300" distR="114300" simplePos="0" relativeHeight="251658249" behindDoc="0" locked="0" layoutInCell="1" allowOverlap="1" wp14:anchorId="6101E863" wp14:editId="7B60FBE3">
+            <wp:simplePos x="0" y="0"/>
+            <wp:positionH relativeFrom="margin">
+              <wp:posOffset>742315</wp:posOffset>
+            </wp:positionH>
+            <wp:positionV relativeFrom="paragraph">
+              <wp:posOffset>9525</wp:posOffset>
+            </wp:positionV>
+            <wp:extent cx="5160407" cy="2559050"/>
+            <wp:effectExtent l="19050" t="19050" r="21590" b="12700"/>
             <wp:wrapNone/>
             <wp:docPr id="378171074" name="Imagen 1"/>
             <wp:cNvGraphicFramePr>
@@ -2020,7 +2543,7 @@
                     <pic:cNvPicPr/>
                   </pic:nvPicPr>
                   <pic:blipFill>
-                    <a:blip r:embed="rId15">
+                    <a:blip r:embed="rId19">
                       <a:extLst>
                         <a:ext uri="{28A0092B-C50C-407E-A947-70E740481C1C}">
                           <a14:useLocalDpi xmlns:a14="http://schemas.microsoft.com/office/drawing/2010/main" val="0"/>
@@ -2034,11 +2557,16 @@
                   <pic:spPr>
                     <a:xfrm>
                       <a:off x="0" y="0"/>
-                      <a:ext cx="5044535" cy="2501589"/>
+                      <a:ext cx="5160407" cy="2559050"/>
                     </a:xfrm>
                     <a:prstGeom prst="rect">
                       <a:avLst/>
                     </a:prstGeom>
+                    <a:ln>
+                      <a:solidFill>
+                        <a:schemeClr val="accent1"/>
+                      </a:solidFill>
+                    </a:ln>
                   </pic:spPr>
                 </pic:pic>
               </a:graphicData>
@@ -2052,17 +2580,7 @@
           </wp:anchor>
         </w:drawing>
       </w:r>
-      <w:r>
-        <w:rPr>
-          <w:b/>
-          <w:bCs/>
-        </w:rPr>
-        <w:t>Sirve para saber quién subió qué, cuándo y para qué grupo</w:t>
-      </w:r>
-    </w:p>
-    <w:p/>
-    <w:p/>
-    <w:p/>
+    </w:p>
     <w:p/>
     <w:p/>
     <w:p/>
@@ -2088,7 +2606,6 @@
           <w:b/>
           <w:bCs/>
         </w:rPr>
-        <w:lastRenderedPageBreak/>
         <w:t xml:space="preserve">Calificaciones -- </w:t>
       </w:r>
       <w:r>
@@ -2113,7 +2630,7 @@
           <w:noProof/>
         </w:rPr>
         <w:drawing>
-          <wp:anchor distT="0" distB="0" distL="114300" distR="114300" simplePos="0" relativeHeight="251668480" behindDoc="0" locked="0" layoutInCell="1" allowOverlap="1" wp14:anchorId="3FACF573" wp14:editId="4F746346">
+          <wp:anchor distT="0" distB="0" distL="114300" distR="114300" simplePos="0" relativeHeight="251658250" behindDoc="0" locked="0" layoutInCell="1" allowOverlap="1" wp14:anchorId="3FACF573" wp14:editId="6B393167">
             <wp:simplePos x="0" y="0"/>
             <wp:positionH relativeFrom="column">
               <wp:posOffset>877529</wp:posOffset>
@@ -2122,7 +2639,7 @@
               <wp:posOffset>320265</wp:posOffset>
             </wp:positionV>
             <wp:extent cx="4490884" cy="2768742"/>
-            <wp:effectExtent l="0" t="0" r="5080" b="0"/>
+            <wp:effectExtent l="19050" t="19050" r="24130" b="12700"/>
             <wp:wrapNone/>
             <wp:docPr id="117580385" name="Imagen 1"/>
             <wp:cNvGraphicFramePr>
@@ -2136,7 +2653,7 @@
                     <pic:cNvPicPr/>
                   </pic:nvPicPr>
                   <pic:blipFill>
-                    <a:blip r:embed="rId16">
+                    <a:blip r:embed="rId20">
                       <a:extLst>
                         <a:ext uri="{28A0092B-C50C-407E-A947-70E740481C1C}">
                           <a14:useLocalDpi xmlns:a14="http://schemas.microsoft.com/office/drawing/2010/main" val="0"/>
@@ -2155,6 +2672,11 @@
                     <a:prstGeom prst="rect">
                       <a:avLst/>
                     </a:prstGeom>
+                    <a:ln>
+                      <a:solidFill>
+                        <a:schemeClr val="accent1"/>
+                      </a:solidFill>
+                    </a:ln>
                   </pic:spPr>
                 </pic:pic>
               </a:graphicData>
@@ -2186,6 +2708,118 @@
     <w:p/>
     <w:p/>
     <w:p>
+      <w:r>
+        <w:rPr>
+          <w:noProof/>
+        </w:rPr>
+        <w:drawing>
+          <wp:anchor distT="0" distB="0" distL="114300" distR="114300" simplePos="0" relativeHeight="251658265" behindDoc="0" locked="0" layoutInCell="1" allowOverlap="1" wp14:anchorId="06F776B2" wp14:editId="60F2FD1B">
+            <wp:simplePos x="0" y="0"/>
+            <wp:positionH relativeFrom="column">
+              <wp:posOffset>874395</wp:posOffset>
+            </wp:positionH>
+            <wp:positionV relativeFrom="paragraph">
+              <wp:posOffset>511308</wp:posOffset>
+            </wp:positionV>
+            <wp:extent cx="4677428" cy="543001"/>
+            <wp:effectExtent l="19050" t="19050" r="8890" b="28575"/>
+            <wp:wrapNone/>
+            <wp:docPr id="1407678327" name="Imagen 1"/>
+            <wp:cNvGraphicFramePr>
+              <a:graphicFrameLocks xmlns:a="http://schemas.openxmlformats.org/drawingml/2006/main" noChangeAspect="1"/>
+            </wp:cNvGraphicFramePr>
+            <a:graphic xmlns:a="http://schemas.openxmlformats.org/drawingml/2006/main">
+              <a:graphicData uri="http://schemas.openxmlformats.org/drawingml/2006/picture">
+                <pic:pic xmlns:pic="http://schemas.openxmlformats.org/drawingml/2006/picture">
+                  <pic:nvPicPr>
+                    <pic:cNvPr id="1407678327" name=""/>
+                    <pic:cNvPicPr/>
+                  </pic:nvPicPr>
+                  <pic:blipFill>
+                    <a:blip r:embed="rId21">
+                      <a:extLst>
+                        <a:ext uri="{28A0092B-C50C-407E-A947-70E740481C1C}">
+                          <a14:useLocalDpi xmlns:a14="http://schemas.microsoft.com/office/drawing/2010/main" val="0"/>
+                        </a:ext>
+                      </a:extLst>
+                    </a:blip>
+                    <a:stretch>
+                      <a:fillRect/>
+                    </a:stretch>
+                  </pic:blipFill>
+                  <pic:spPr>
+                    <a:xfrm>
+                      <a:off x="0" y="0"/>
+                      <a:ext cx="4677428" cy="543001"/>
+                    </a:xfrm>
+                    <a:prstGeom prst="rect">
+                      <a:avLst/>
+                    </a:prstGeom>
+                    <a:ln>
+                      <a:solidFill>
+                        <a:schemeClr val="accent1"/>
+                      </a:solidFill>
+                    </a:ln>
+                  </pic:spPr>
+                </pic:pic>
+              </a:graphicData>
+            </a:graphic>
+          </wp:anchor>
+        </w:drawing>
+      </w:r>
+      <w:r>
+        <w:t xml:space="preserve"> </w:t>
+      </w:r>
+      <w:r>
+        <w:tab/>
+      </w:r>
+      <w:r>
+        <w:tab/>
+        <w:t>Modificación</w:t>
+      </w:r>
+      <w:r>
+        <w:t xml:space="preserve"> </w:t>
+      </w:r>
+      <w:r>
+        <w:t xml:space="preserve">en el campo </w:t>
+      </w:r>
+      <w:r>
+        <w:rPr>
+          <w:b/>
+          <w:bCs/>
+        </w:rPr>
+        <w:t xml:space="preserve">Aprobado </w:t>
+      </w:r>
+      <w:r>
+        <w:t xml:space="preserve">quitando la lógica de </w:t>
+      </w:r>
+      <w:r>
+        <w:rPr>
+          <w:b/>
+          <w:bCs/>
+        </w:rPr>
+        <w:t xml:space="preserve">ALWAYS </w:t>
+      </w:r>
+      <w:r>
+        <w:t>para</w:t>
+      </w:r>
+      <w:r>
+        <w:br/>
+        <w:t xml:space="preserve"> </w:t>
+      </w:r>
+      <w:r>
+        <w:tab/>
+      </w:r>
+      <w:r>
+        <w:tab/>
+        <w:t>poder implementarla en el código de importación.</w:t>
+      </w:r>
+    </w:p>
+    <w:p/>
+    <w:p/>
+    <w:p/>
+    <w:p/>
+    <w:p>
       <w:pPr>
         <w:pStyle w:val="Prrafodelista"/>
         <w:numPr>
@@ -2202,7 +2836,7 @@
           <w:noProof/>
         </w:rPr>
         <w:drawing>
-          <wp:anchor distT="0" distB="0" distL="114300" distR="114300" simplePos="0" relativeHeight="251669504" behindDoc="0" locked="0" layoutInCell="1" allowOverlap="1" wp14:anchorId="675BF761" wp14:editId="41D154EA">
+          <wp:anchor distT="0" distB="0" distL="114300" distR="114300" simplePos="0" relativeHeight="251658251" behindDoc="0" locked="0" layoutInCell="1" allowOverlap="1" wp14:anchorId="675BF761" wp14:editId="24387AD2">
             <wp:simplePos x="0" y="0"/>
             <wp:positionH relativeFrom="column">
               <wp:posOffset>840105</wp:posOffset>
@@ -2211,7 +2845,7 @@
               <wp:posOffset>289949</wp:posOffset>
             </wp:positionV>
             <wp:extent cx="4346713" cy="1461460"/>
-            <wp:effectExtent l="0" t="0" r="0" b="5715"/>
+            <wp:effectExtent l="19050" t="19050" r="15875" b="24765"/>
             <wp:wrapNone/>
             <wp:docPr id="1876543800" name="Imagen 1"/>
             <wp:cNvGraphicFramePr>
@@ -2225,7 +2859,7 @@
                     <pic:cNvPicPr/>
                   </pic:nvPicPr>
                   <pic:blipFill>
-                    <a:blip r:embed="rId17">
+                    <a:blip r:embed="rId22">
                       <a:extLst>
                         <a:ext uri="{28A0092B-C50C-407E-A947-70E740481C1C}">
                           <a14:useLocalDpi xmlns:a14="http://schemas.microsoft.com/office/drawing/2010/main" val="0"/>
@@ -2244,6 +2878,11 @@
                     <a:prstGeom prst="rect">
                       <a:avLst/>
                     </a:prstGeom>
+                    <a:ln>
+                      <a:solidFill>
+                        <a:schemeClr val="accent1"/>
+                      </a:solidFill>
+                    </a:ln>
                   </pic:spPr>
                 </pic:pic>
               </a:graphicData>
@@ -2276,7 +2915,7 @@
           <w:noProof/>
         </w:rPr>
         <w:drawing>
-          <wp:anchor distT="0" distB="0" distL="114300" distR="114300" simplePos="0" relativeHeight="251670528" behindDoc="0" locked="0" layoutInCell="1" allowOverlap="1" wp14:anchorId="7CF70D35" wp14:editId="18AD7FAB">
+          <wp:anchor distT="0" distB="0" distL="114300" distR="114300" simplePos="0" relativeHeight="251658252" behindDoc="0" locked="0" layoutInCell="1" allowOverlap="1" wp14:anchorId="7CF70D35" wp14:editId="36347DFF">
             <wp:simplePos x="0" y="0"/>
             <wp:positionH relativeFrom="margin">
               <wp:posOffset>804545</wp:posOffset>
@@ -2285,7 +2924,7 @@
               <wp:posOffset>257564</wp:posOffset>
             </wp:positionV>
             <wp:extent cx="4925961" cy="901065"/>
-            <wp:effectExtent l="0" t="0" r="8255" b="0"/>
+            <wp:effectExtent l="19050" t="19050" r="27305" b="13335"/>
             <wp:wrapNone/>
             <wp:docPr id="1109746463" name="Imagen 1"/>
             <wp:cNvGraphicFramePr>
@@ -2299,7 +2938,7 @@
                     <pic:cNvPicPr/>
                   </pic:nvPicPr>
                   <pic:blipFill>
-                    <a:blip r:embed="rId18">
+                    <a:blip r:embed="rId23">
                       <a:extLst>
                         <a:ext uri="{28A0092B-C50C-407E-A947-70E740481C1C}">
                           <a14:useLocalDpi xmlns:a14="http://schemas.microsoft.com/office/drawing/2010/main" val="0"/>
@@ -2318,6 +2957,11 @@
                     <a:prstGeom prst="rect">
                       <a:avLst/>
                     </a:prstGeom>
+                    <a:ln>
+                      <a:solidFill>
+                        <a:schemeClr val="accent1"/>
+                      </a:solidFill>
+                    </a:ln>
                   </pic:spPr>
                 </pic:pic>
               </a:graphicData>
@@ -2342,27 +2986,24 @@
           <w:sz w:val="22"/>
           <w:szCs w:val="22"/>
         </w:rPr>
-        <w:t xml:space="preserve">--Datos del Catalogo del </w:t>
-      </w:r>
-      <w:proofErr w:type="spellStart"/>
-      <w:r>
-        <w:rPr>
-          <w:sz w:val="22"/>
-          <w:szCs w:val="22"/>
-        </w:rPr>
-        <w:t>Semaforo</w:t>
-      </w:r>
-      <w:proofErr w:type="spellEnd"/>
-    </w:p>
-    <w:p/>
-    <w:p/>
+        <w:t>--Datos del Catalogo del Semaforo</w:t>
+      </w:r>
+    </w:p>
+    <w:p/>
+    <w:p>
+      <w:pPr>
+        <w:rPr>
+          <w:lang w:val="en-US"/>
+        </w:rPr>
+      </w:pPr>
+    </w:p>
     <w:p>
       <w:r>
         <w:rPr>
           <w:noProof/>
         </w:rPr>
         <w:drawing>
-          <wp:anchor distT="0" distB="0" distL="114300" distR="114300" simplePos="0" relativeHeight="251671552" behindDoc="0" locked="0" layoutInCell="1" allowOverlap="1" wp14:anchorId="46D4112B" wp14:editId="1DA429B9">
+          <wp:anchor distT="0" distB="0" distL="114300" distR="114300" simplePos="0" relativeHeight="251658253" behindDoc="0" locked="0" layoutInCell="1" allowOverlap="1" wp14:anchorId="46D4112B" wp14:editId="24FDDE50">
             <wp:simplePos x="0" y="0"/>
             <wp:positionH relativeFrom="column">
               <wp:posOffset>796413</wp:posOffset>
@@ -2371,7 +3012,7 @@
               <wp:posOffset>276102</wp:posOffset>
             </wp:positionV>
             <wp:extent cx="5020642" cy="774290"/>
-            <wp:effectExtent l="0" t="0" r="0" b="6985"/>
+            <wp:effectExtent l="19050" t="19050" r="8890" b="26035"/>
             <wp:wrapNone/>
             <wp:docPr id="1896796458" name="Imagen 1"/>
             <wp:cNvGraphicFramePr>
@@ -2385,7 +3026,7 @@
                     <pic:cNvPicPr/>
                   </pic:nvPicPr>
                   <pic:blipFill>
-                    <a:blip r:embed="rId19">
+                    <a:blip r:embed="rId24">
                       <a:extLst>
                         <a:ext uri="{28A0092B-C50C-407E-A947-70E740481C1C}">
                           <a14:useLocalDpi xmlns:a14="http://schemas.microsoft.com/office/drawing/2010/main" val="0"/>
@@ -2404,6 +3045,11 @@
                     <a:prstGeom prst="rect">
                       <a:avLst/>
                     </a:prstGeom>
+                    <a:ln>
+                      <a:solidFill>
+                        <a:schemeClr val="accent1"/>
+                      </a:solidFill>
+                    </a:ln>
                   </pic:spPr>
                 </pic:pic>
               </a:graphicData>
@@ -2421,9 +3067,6 @@
     <w:p/>
     <w:p/>
     <w:p/>
-    <w:p/>
-    <w:p/>
-    <w:p/>
     <w:p>
       <w:pPr>
         <w:pStyle w:val="Prrafodelista"/>
@@ -2443,9 +3086,8 @@
           <w:noProof/>
           <w:lang w:val="en-US"/>
         </w:rPr>
-        <w:lastRenderedPageBreak/>
         <w:drawing>
-          <wp:anchor distT="0" distB="0" distL="114300" distR="114300" simplePos="0" relativeHeight="251672576" behindDoc="0" locked="0" layoutInCell="1" allowOverlap="1" wp14:anchorId="59016D29" wp14:editId="4C838F60">
+          <wp:anchor distT="0" distB="0" distL="114300" distR="114300" simplePos="0" relativeHeight="251658254" behindDoc="0" locked="0" layoutInCell="1" allowOverlap="1" wp14:anchorId="59016D29" wp14:editId="38335524">
             <wp:simplePos x="0" y="0"/>
             <wp:positionH relativeFrom="column">
               <wp:posOffset>883920</wp:posOffset>
@@ -2454,7 +3096,7 @@
               <wp:posOffset>277741</wp:posOffset>
             </wp:positionV>
             <wp:extent cx="4468761" cy="2717102"/>
-            <wp:effectExtent l="0" t="0" r="8255" b="7620"/>
+            <wp:effectExtent l="19050" t="19050" r="27305" b="26670"/>
             <wp:wrapNone/>
             <wp:docPr id="321881612" name="Imagen 1"/>
             <wp:cNvGraphicFramePr>
@@ -2468,7 +3110,7 @@
                     <pic:cNvPicPr/>
                   </pic:nvPicPr>
                   <pic:blipFill>
-                    <a:blip r:embed="rId20">
+                    <a:blip r:embed="rId25">
                       <a:extLst>
                         <a:ext uri="{28A0092B-C50C-407E-A947-70E740481C1C}">
                           <a14:useLocalDpi xmlns:a14="http://schemas.microsoft.com/office/drawing/2010/main" val="0"/>
@@ -2487,6 +3129,11 @@
                     <a:prstGeom prst="rect">
                       <a:avLst/>
                     </a:prstGeom>
+                    <a:ln>
+                      <a:solidFill>
+                        <a:schemeClr val="accent1"/>
+                      </a:solidFill>
+                    </a:ln>
                   </pic:spPr>
                 </pic:pic>
               </a:graphicData>
@@ -2522,6 +3169,15 @@
     <w:p/>
     <w:p/>
     <w:p/>
+    <w:p>
+      <w:r>
+        <w:t>.</w:t>
+      </w:r>
+    </w:p>
+    <w:p/>
+    <w:p/>
+    <w:p/>
+    <w:p/>
     <w:p/>
     <w:p>
       <w:pPr>
@@ -2537,20 +3193,36 @@
       </w:pPr>
       <w:r>
         <w:rPr>
+          <w:b/>
+          <w:bCs/>
+        </w:rPr>
+        <w:t>Tutor_Grupo – Usuarios con rol “Tutor”</w:t>
+      </w:r>
+      <w:r>
+        <w:rPr>
+          <w:b/>
+          <w:bCs/>
+        </w:rPr>
+        <w:t xml:space="preserve"> lo liga a un grupo por periodo</w:t>
+      </w:r>
+    </w:p>
+    <w:p>
+      <w:r>
+        <w:rPr>
           <w:noProof/>
           <w:lang w:val="en-US"/>
         </w:rPr>
         <w:drawing>
-          <wp:anchor distT="0" distB="0" distL="114300" distR="114300" simplePos="0" relativeHeight="251673600" behindDoc="0" locked="0" layoutInCell="1" allowOverlap="1" wp14:anchorId="074382FD" wp14:editId="64825053">
+          <wp:anchor distT="0" distB="0" distL="114300" distR="114300" simplePos="0" relativeHeight="251658255" behindDoc="0" locked="0" layoutInCell="1" allowOverlap="1" wp14:anchorId="074382FD" wp14:editId="15DFB9E2">
             <wp:simplePos x="0" y="0"/>
             <wp:positionH relativeFrom="column">
-              <wp:posOffset>886265</wp:posOffset>
+              <wp:posOffset>724486</wp:posOffset>
             </wp:positionH>
             <wp:positionV relativeFrom="paragraph">
-              <wp:posOffset>254928</wp:posOffset>
+              <wp:posOffset>4689</wp:posOffset>
             </wp:positionV>
-            <wp:extent cx="4598828" cy="1913206"/>
-            <wp:effectExtent l="0" t="0" r="0" b="0"/>
+            <wp:extent cx="5516880" cy="2862776"/>
+            <wp:effectExtent l="19050" t="19050" r="26670" b="13970"/>
             <wp:wrapNone/>
             <wp:docPr id="806456001" name="Imagen 1"/>
             <wp:cNvGraphicFramePr>
@@ -2564,7 +3236,7 @@
                     <pic:cNvPicPr/>
                   </pic:nvPicPr>
                   <pic:blipFill>
-                    <a:blip r:embed="rId21">
+                    <a:blip r:embed="rId26">
                       <a:extLst>
                         <a:ext uri="{28A0092B-C50C-407E-A947-70E740481C1C}">
                           <a14:useLocalDpi xmlns:a14="http://schemas.microsoft.com/office/drawing/2010/main" val="0"/>
@@ -2578,11 +3250,16 @@
                   <pic:spPr>
                     <a:xfrm>
                       <a:off x="0" y="0"/>
-                      <a:ext cx="4607857" cy="1916962"/>
+                      <a:ext cx="5522533" cy="2865709"/>
                     </a:xfrm>
                     <a:prstGeom prst="rect">
                       <a:avLst/>
                     </a:prstGeom>
+                    <a:ln>
+                      <a:solidFill>
+                        <a:schemeClr val="accent1"/>
+                      </a:solidFill>
+                    </a:ln>
                   </pic:spPr>
                 </pic:pic>
               </a:graphicData>
@@ -2596,21 +3273,10 @@
           </wp:anchor>
         </w:drawing>
       </w:r>
-      <w:r>
-        <w:rPr>
-          <w:b/>
-          <w:bCs/>
-        </w:rPr>
-        <w:t>Tutor_Grupo – Usuarios con rol “Tutor”</w:t>
-      </w:r>
-      <w:r>
-        <w:rPr>
-          <w:b/>
-          <w:bCs/>
-        </w:rPr>
-        <w:t xml:space="preserve"> lo liga a un grupo por periodo</w:t>
-      </w:r>
-    </w:p>
+    </w:p>
+    <w:p/>
+    <w:p/>
+    <w:p/>
     <w:p/>
     <w:p/>
     <w:p/>
@@ -2648,7 +3314,7 @@
           <w:lang w:val="en-US"/>
         </w:rPr>
         <w:drawing>
-          <wp:anchor distT="0" distB="0" distL="114300" distR="114300" simplePos="0" relativeHeight="251674624" behindDoc="0" locked="0" layoutInCell="1" allowOverlap="1" wp14:anchorId="073554BF" wp14:editId="659D3ED6">
+          <wp:anchor distT="0" distB="0" distL="114300" distR="114300" simplePos="0" relativeHeight="251658256" behindDoc="0" locked="0" layoutInCell="1" allowOverlap="1" wp14:anchorId="073554BF" wp14:editId="4696ED7E">
             <wp:simplePos x="0" y="0"/>
             <wp:positionH relativeFrom="column">
               <wp:posOffset>874395</wp:posOffset>
@@ -2657,7 +3323,7 @@
               <wp:posOffset>27354</wp:posOffset>
             </wp:positionV>
             <wp:extent cx="4823460" cy="2757805"/>
-            <wp:effectExtent l="0" t="0" r="0" b="4445"/>
+            <wp:effectExtent l="19050" t="19050" r="15240" b="23495"/>
             <wp:wrapNone/>
             <wp:docPr id="1492558119" name="Imagen 1"/>
             <wp:cNvGraphicFramePr>
@@ -2671,7 +3337,7 @@
                     <pic:cNvPicPr/>
                   </pic:nvPicPr>
                   <pic:blipFill>
-                    <a:blip r:embed="rId22">
+                    <a:blip r:embed="rId27">
                       <a:extLst>
                         <a:ext uri="{28A0092B-C50C-407E-A947-70E740481C1C}">
                           <a14:useLocalDpi xmlns:a14="http://schemas.microsoft.com/office/drawing/2010/main" val="0"/>
@@ -2690,6 +3356,11 @@
                     <a:prstGeom prst="rect">
                       <a:avLst/>
                     </a:prstGeom>
+                    <a:ln>
+                      <a:solidFill>
+                        <a:schemeClr val="accent1"/>
+                      </a:solidFill>
+                    </a:ln>
                   </pic:spPr>
                 </pic:pic>
               </a:graphicData>
@@ -2706,6 +3377,174 @@
     <w:p/>
     <w:p/>
     <w:p/>
+    <w:p>
+      <w:pPr>
+        <w:rPr>
+          <w:b/>
+          <w:bCs/>
+        </w:rPr>
+      </w:pPr>
+      <w:r>
+        <w:rPr>
+          <w:b/>
+          <w:bCs/>
+          <w:noProof/>
+        </w:rPr>
+        <w:drawing>
+          <wp:anchor distT="0" distB="0" distL="114300" distR="114300" simplePos="0" relativeHeight="251658262" behindDoc="0" locked="0" layoutInCell="1" allowOverlap="1" wp14:anchorId="292181FC" wp14:editId="5A841E93">
+            <wp:simplePos x="0" y="0"/>
+            <wp:positionH relativeFrom="margin">
+              <wp:posOffset>1096645</wp:posOffset>
+            </wp:positionH>
+            <wp:positionV relativeFrom="paragraph">
+              <wp:posOffset>512396</wp:posOffset>
+            </wp:positionV>
+            <wp:extent cx="4549140" cy="1414780"/>
+            <wp:effectExtent l="19050" t="19050" r="22860" b="13970"/>
+            <wp:wrapNone/>
+            <wp:docPr id="259361253" name="Imagen 1"/>
+            <wp:cNvGraphicFramePr>
+              <a:graphicFrameLocks xmlns:a="http://schemas.openxmlformats.org/drawingml/2006/main" noChangeAspect="1"/>
+            </wp:cNvGraphicFramePr>
+            <a:graphic xmlns:a="http://schemas.openxmlformats.org/drawingml/2006/main">
+              <a:graphicData uri="http://schemas.openxmlformats.org/drawingml/2006/picture">
+                <pic:pic xmlns:pic="http://schemas.openxmlformats.org/drawingml/2006/picture">
+                  <pic:nvPicPr>
+                    <pic:cNvPr id="259361253" name=""/>
+                    <pic:cNvPicPr/>
+                  </pic:nvPicPr>
+                  <pic:blipFill>
+                    <a:blip r:embed="rId28">
+                      <a:extLst>
+                        <a:ext uri="{28A0092B-C50C-407E-A947-70E740481C1C}">
+                          <a14:useLocalDpi xmlns:a14="http://schemas.microsoft.com/office/drawing/2010/main" val="0"/>
+                        </a:ext>
+                      </a:extLst>
+                    </a:blip>
+                    <a:stretch>
+                      <a:fillRect/>
+                    </a:stretch>
+                  </pic:blipFill>
+                  <pic:spPr>
+                    <a:xfrm>
+                      <a:off x="0" y="0"/>
+                      <a:ext cx="4549140" cy="1414780"/>
+                    </a:xfrm>
+                    <a:prstGeom prst="rect">
+                      <a:avLst/>
+                    </a:prstGeom>
+                    <a:ln>
+                      <a:solidFill>
+                        <a:schemeClr val="accent1"/>
+                      </a:solidFill>
+                    </a:ln>
+                  </pic:spPr>
+                </pic:pic>
+              </a:graphicData>
+            </a:graphic>
+            <wp14:sizeRelH relativeFrom="margin">
+              <wp14:pctWidth>0</wp14:pctWidth>
+            </wp14:sizeRelH>
+            <wp14:sizeRelV relativeFrom="margin">
+              <wp14:pctHeight>0</wp14:pctHeight>
+            </wp14:sizeRelV>
+          </wp:anchor>
+        </w:drawing>
+      </w:r>
+      <w:r>
+        <w:t xml:space="preserve"> </w:t>
+      </w:r>
+      <w:r>
+        <w:tab/>
+      </w:r>
+      <w:r>
+        <w:tab/>
+        <w:t xml:space="preserve">  </w:t>
+      </w:r>
+      <w:r>
+        <w:tab/>
+        <w:t xml:space="preserve"> Cambio en la Tabla </w:t>
+      </w:r>
+      <w:r>
+        <w:rPr>
+          <w:b/>
+          <w:bCs/>
+        </w:rPr>
+        <w:t xml:space="preserve">Horarios </w:t>
+      </w:r>
+      <w:r>
+        <w:t xml:space="preserve">para que </w:t>
+      </w:r>
+      <w:r>
+        <w:rPr>
+          <w:b/>
+          <w:bCs/>
+        </w:rPr>
+        <w:t xml:space="preserve">Aula </w:t>
+      </w:r>
+      <w:r>
+        <w:t>no sea solo un varchar</w:t>
+      </w:r>
+      <w:r>
+        <w:br/>
+        <w:t xml:space="preserve"> </w:t>
+      </w:r>
+      <w:r>
+        <w:tab/>
+      </w:r>
+      <w:r>
+        <w:tab/>
+      </w:r>
+      <w:r>
+        <w:tab/>
+        <w:t xml:space="preserve"> sino ya </w:t>
+      </w:r>
+      <w:r>
+        <w:t>una tabla completa</w:t>
+      </w:r>
+      <w:r>
+        <w:t xml:space="preserve"> cambiando el campo por </w:t>
+      </w:r>
+      <w:r>
+        <w:rPr>
+          <w:b/>
+          <w:bCs/>
+        </w:rPr>
+        <w:t>Id_Aula</w:t>
+      </w:r>
+    </w:p>
+    <w:p>
+      <w:pPr>
+        <w:rPr>
+          <w:b/>
+          <w:bCs/>
+        </w:rPr>
+      </w:pPr>
+      <w:r>
+        <w:rPr>
+          <w:b/>
+          <w:bCs/>
+        </w:rPr>
+        <w:br/>
+      </w:r>
+    </w:p>
+    <w:p>
+      <w:pPr>
+        <w:rPr>
+          <w:b/>
+          <w:bCs/>
+        </w:rPr>
+      </w:pPr>
+    </w:p>
+    <w:p>
+      <w:pPr>
+        <w:rPr>
+          <w:b/>
+          <w:bCs/>
+        </w:rPr>
+      </w:pPr>
+    </w:p>
+    <w:p/>
     <w:p/>
     <w:p>
       <w:pPr>
@@ -2724,9 +3563,8 @@
           <w:noProof/>
           <w:lang w:val="en-US"/>
         </w:rPr>
-        <w:lastRenderedPageBreak/>
         <w:drawing>
-          <wp:anchor distT="0" distB="0" distL="114300" distR="114300" simplePos="0" relativeHeight="251675648" behindDoc="0" locked="0" layoutInCell="1" allowOverlap="1" wp14:anchorId="4F67EC25" wp14:editId="2CE42A76">
+          <wp:anchor distT="0" distB="0" distL="114300" distR="114300" simplePos="0" relativeHeight="251658257" behindDoc="0" locked="0" layoutInCell="1" allowOverlap="1" wp14:anchorId="4F67EC25" wp14:editId="21CD09EA">
             <wp:simplePos x="0" y="0"/>
             <wp:positionH relativeFrom="column">
               <wp:posOffset>858129</wp:posOffset>
@@ -2735,7 +3573,7 @@
               <wp:posOffset>253218</wp:posOffset>
             </wp:positionV>
             <wp:extent cx="4498366" cy="2511084"/>
-            <wp:effectExtent l="0" t="0" r="0" b="3810"/>
+            <wp:effectExtent l="19050" t="19050" r="16510" b="22860"/>
             <wp:wrapNone/>
             <wp:docPr id="1240935376" name="Imagen 1"/>
             <wp:cNvGraphicFramePr>
@@ -2749,7 +3587,7 @@
                     <pic:cNvPicPr/>
                   </pic:nvPicPr>
                   <pic:blipFill>
-                    <a:blip r:embed="rId23">
+                    <a:blip r:embed="rId29">
                       <a:extLst>
                         <a:ext uri="{28A0092B-C50C-407E-A947-70E740481C1C}">
                           <a14:useLocalDpi xmlns:a14="http://schemas.microsoft.com/office/drawing/2010/main" val="0"/>
@@ -2768,6 +3606,11 @@
                     <a:prstGeom prst="rect">
                       <a:avLst/>
                     </a:prstGeom>
+                    <a:ln>
+                      <a:solidFill>
+                        <a:schemeClr val="accent1"/>
+                      </a:solidFill>
+                    </a:ln>
                   </pic:spPr>
                 </pic:pic>
               </a:graphicData>
@@ -2812,7 +3655,7 @@
           <w:lang w:val="en-US"/>
         </w:rPr>
         <w:drawing>
-          <wp:anchor distT="0" distB="0" distL="114300" distR="114300" simplePos="0" relativeHeight="251676672" behindDoc="0" locked="0" layoutInCell="1" allowOverlap="1" wp14:anchorId="546178C1" wp14:editId="54EE9FA2">
+          <wp:anchor distT="0" distB="0" distL="114300" distR="114300" simplePos="0" relativeHeight="251658258" behindDoc="0" locked="0" layoutInCell="1" allowOverlap="1" wp14:anchorId="546178C1" wp14:editId="3499FB8E">
             <wp:simplePos x="0" y="0"/>
             <wp:positionH relativeFrom="column">
               <wp:posOffset>886265</wp:posOffset>
@@ -2821,7 +3664,7 @@
               <wp:posOffset>456466</wp:posOffset>
             </wp:positionV>
             <wp:extent cx="4613093" cy="2236763"/>
-            <wp:effectExtent l="0" t="0" r="0" b="0"/>
+            <wp:effectExtent l="19050" t="19050" r="16510" b="11430"/>
             <wp:wrapNone/>
             <wp:docPr id="281504972" name="Imagen 1"/>
             <wp:cNvGraphicFramePr>
@@ -2835,7 +3678,7 @@
                     <pic:cNvPicPr/>
                   </pic:nvPicPr>
                   <pic:blipFill>
-                    <a:blip r:embed="rId24">
+                    <a:blip r:embed="rId30">
                       <a:extLst>
                         <a:ext uri="{28A0092B-C50C-407E-A947-70E740481C1C}">
                           <a14:useLocalDpi xmlns:a14="http://schemas.microsoft.com/office/drawing/2010/main" val="0"/>
@@ -2854,6 +3697,11 @@
                     <a:prstGeom prst="rect">
                       <a:avLst/>
                     </a:prstGeom>
+                    <a:ln>
+                      <a:solidFill>
+                        <a:schemeClr val="accent1"/>
+                      </a:solidFill>
+                    </a:ln>
                   </pic:spPr>
                 </pic:pic>
               </a:graphicData>
@@ -2887,14 +3735,7 @@
     <w:p/>
     <w:p/>
     <w:p/>
-    <w:p>
-      <w:pPr>
-        <w:rPr>
-          <w:b/>
-          <w:bCs/>
-        </w:rPr>
-      </w:pPr>
-    </w:p>
+    <w:p/>
     <w:p>
       <w:pPr>
         <w:rPr>
@@ -2921,7 +3762,7 @@
           <w:lang w:val="en-US"/>
         </w:rPr>
         <w:drawing>
-          <wp:anchor distT="0" distB="0" distL="114300" distR="114300" simplePos="0" relativeHeight="251677696" behindDoc="0" locked="0" layoutInCell="1" allowOverlap="1" wp14:anchorId="6CBAD44A" wp14:editId="13F8E251">
+          <wp:anchor distT="0" distB="0" distL="114300" distR="114300" simplePos="0" relativeHeight="251658259" behindDoc="0" locked="0" layoutInCell="1" allowOverlap="1" wp14:anchorId="6CBAD44A" wp14:editId="4517745E">
             <wp:simplePos x="0" y="0"/>
             <wp:positionH relativeFrom="column">
               <wp:posOffset>864870</wp:posOffset>
@@ -2930,7 +3771,7 @@
               <wp:posOffset>240079</wp:posOffset>
             </wp:positionV>
             <wp:extent cx="4874455" cy="2694940"/>
-            <wp:effectExtent l="0" t="0" r="2540" b="0"/>
+            <wp:effectExtent l="19050" t="19050" r="21590" b="10160"/>
             <wp:wrapNone/>
             <wp:docPr id="101448974" name="Imagen 1"/>
             <wp:cNvGraphicFramePr>
@@ -2944,7 +3785,7 @@
                     <pic:cNvPicPr/>
                   </pic:nvPicPr>
                   <pic:blipFill>
-                    <a:blip r:embed="rId25">
+                    <a:blip r:embed="rId31">
                       <a:extLst>
                         <a:ext uri="{28A0092B-C50C-407E-A947-70E740481C1C}">
                           <a14:useLocalDpi xmlns:a14="http://schemas.microsoft.com/office/drawing/2010/main" val="0"/>
@@ -2963,6 +3804,11 @@
                     <a:prstGeom prst="rect">
                       <a:avLst/>
                     </a:prstGeom>
+                    <a:ln>
+                      <a:solidFill>
+                        <a:schemeClr val="accent1"/>
+                      </a:solidFill>
+                    </a:ln>
                   </pic:spPr>
                 </pic:pic>
               </a:graphicData>
@@ -2989,32 +3835,25 @@
     <w:p/>
     <w:p/>
     <w:p/>
-    <w:p>
-      <w:pPr>
-        <w:pStyle w:val="Prrafodelista"/>
-        <w:numPr>
-          <w:ilvl w:val="0"/>
-          <w:numId w:val="1"/>
-        </w:numPr>
-      </w:pPr>
+    <w:p/>
+    <w:p>
       <w:r>
         <w:rPr>
           <w:noProof/>
         </w:rPr>
-        <w:lastRenderedPageBreak/>
         <w:drawing>
-          <wp:anchor distT="0" distB="0" distL="114300" distR="114300" simplePos="0" relativeHeight="251678720" behindDoc="0" locked="0" layoutInCell="1" allowOverlap="1" wp14:anchorId="23B5384A" wp14:editId="3D7B0220">
+          <wp:anchor distT="0" distB="0" distL="114300" distR="114300" simplePos="0" relativeHeight="251658266" behindDoc="0" locked="0" layoutInCell="1" allowOverlap="1" wp14:anchorId="2C3CBC94" wp14:editId="080C829B">
             <wp:simplePos x="0" y="0"/>
-            <wp:positionH relativeFrom="column">
-              <wp:posOffset>-717551</wp:posOffset>
+            <wp:positionH relativeFrom="margin">
+              <wp:posOffset>977900</wp:posOffset>
             </wp:positionH>
             <wp:positionV relativeFrom="paragraph">
-              <wp:posOffset>285750</wp:posOffset>
+              <wp:posOffset>514800</wp:posOffset>
             </wp:positionV>
-            <wp:extent cx="7198205" cy="4730750"/>
-            <wp:effectExtent l="0" t="0" r="3175" b="0"/>
+            <wp:extent cx="4531488" cy="1083874"/>
+            <wp:effectExtent l="0" t="0" r="2540" b="2540"/>
             <wp:wrapNone/>
-            <wp:docPr id="1067232382" name="Imagen 3"/>
+            <wp:docPr id="1308964963" name="Imagen 1"/>
             <wp:cNvGraphicFramePr>
               <a:graphicFrameLocks xmlns:a="http://schemas.openxmlformats.org/drawingml/2006/main" noChangeAspect="1"/>
             </wp:cNvGraphicFramePr>
@@ -3022,36 +3861,145 @@
               <a:graphicData uri="http://schemas.openxmlformats.org/drawingml/2006/picture">
                 <pic:pic xmlns:pic="http://schemas.openxmlformats.org/drawingml/2006/picture">
                   <pic:nvPicPr>
-                    <pic:cNvPr id="0" name="Picture 8"/>
-                    <pic:cNvPicPr>
-                      <a:picLocks noChangeAspect="1" noChangeArrowheads="1"/>
-                    </pic:cNvPicPr>
+                    <pic:cNvPr id="1308964963" name=""/>
+                    <pic:cNvPicPr/>
                   </pic:nvPicPr>
                   <pic:blipFill>
-                    <a:blip r:embed="rId26">
+                    <a:blip r:embed="rId32">
                       <a:extLst>
                         <a:ext uri="{28A0092B-C50C-407E-A947-70E740481C1C}">
                           <a14:useLocalDpi xmlns:a14="http://schemas.microsoft.com/office/drawing/2010/main" val="0"/>
                         </a:ext>
                       </a:extLst>
                     </a:blip>
-                    <a:srcRect/>
                     <a:stretch>
                       <a:fillRect/>
                     </a:stretch>
                   </pic:blipFill>
-                  <pic:spPr bwMode="auto">
+                  <pic:spPr>
                     <a:xfrm>
                       <a:off x="0" y="0"/>
-                      <a:ext cx="7205070" cy="4735262"/>
+                      <a:ext cx="4531488" cy="1083874"/>
                     </a:xfrm>
                     <a:prstGeom prst="rect">
                       <a:avLst/>
                     </a:prstGeom>
-                    <a:noFill/>
-                    <a:ln>
-                      <a:noFill/>
-                    </a:ln>
+                  </pic:spPr>
+                </pic:pic>
+              </a:graphicData>
+            </a:graphic>
+            <wp14:sizeRelH relativeFrom="margin">
+              <wp14:pctWidth>0</wp14:pctWidth>
+            </wp14:sizeRelH>
+          </wp:anchor>
+        </w:drawing>
+      </w:r>
+      <w:r>
+        <w:t xml:space="preserve"> </w:t>
+      </w:r>
+      <w:r>
+        <w:tab/>
+      </w:r>
+      <w:r>
+        <w:tab/>
+        <w:t xml:space="preserve">Agregamos el campo de </w:t>
+      </w:r>
+      <w:r>
+        <w:rPr>
+          <w:b/>
+          <w:bCs/>
+        </w:rPr>
+        <w:t>Id_Alerta</w:t>
+      </w:r>
+      <w:r>
+        <w:rPr>
+          <w:b/>
+          <w:bCs/>
+        </w:rPr>
+        <w:t xml:space="preserve"> </w:t>
+      </w:r>
+      <w:r>
+        <w:t xml:space="preserve">para así saber quien esta riesgo y en </w:t>
+      </w:r>
+      <w:r>
+        <w:tab/>
+      </w:r>
+      <w:r>
+        <w:tab/>
+        <w:t>nivel de alerta se encuentra dicho alumno.</w:t>
+      </w:r>
+      <w:r>
+        <w:br/>
+      </w:r>
+    </w:p>
+    <w:p/>
+    <w:p>
+      <w:pPr>
+        <w:sectPr>
+          <w:type w:val="continuous"/>
+          <w:pgSz w:w="11906" w:h="16838"/>
+          <w:pgMar w:top="1440" w:right="1440" w:bottom="1440" w:left="1440" w:header="709" w:footer="709" w:gutter="0"/>
+          <w:cols w:space="708"/>
+          <w:docGrid w:linePitch="360"/>
+        </w:sectPr>
+      </w:pPr>
+    </w:p>
+    <w:p>
+      <w:pPr>
+        <w:pStyle w:val="Prrafodelista"/>
+        <w:numPr>
+          <w:ilvl w:val="0"/>
+          <w:numId w:val="1"/>
+        </w:numPr>
+      </w:pPr>
+      <w:r>
+        <w:rPr>
+          <w:noProof/>
+        </w:rPr>
+        <w:lastRenderedPageBreak/>
+        <w:drawing>
+          <wp:anchor distT="0" distB="0" distL="114300" distR="114300" simplePos="0" relativeHeight="251658263" behindDoc="0" locked="0" layoutInCell="1" allowOverlap="1" wp14:anchorId="1819E96F" wp14:editId="51BAB466">
+            <wp:simplePos x="0" y="0"/>
+            <wp:positionH relativeFrom="margin">
+              <wp:align>center</wp:align>
+            </wp:positionH>
+            <wp:positionV relativeFrom="paragraph">
+              <wp:posOffset>252583</wp:posOffset>
+            </wp:positionV>
+            <wp:extent cx="9319651" cy="6184132"/>
+            <wp:effectExtent l="0" t="0" r="0" b="7620"/>
+            <wp:wrapNone/>
+            <wp:docPr id="780607977" name="Imagen 1"/>
+            <wp:cNvGraphicFramePr>
+              <a:graphicFrameLocks xmlns:a="http://schemas.openxmlformats.org/drawingml/2006/main" noChangeAspect="1"/>
+            </wp:cNvGraphicFramePr>
+            <a:graphic xmlns:a="http://schemas.openxmlformats.org/drawingml/2006/main">
+              <a:graphicData uri="http://schemas.openxmlformats.org/drawingml/2006/picture">
+                <pic:pic xmlns:pic="http://schemas.openxmlformats.org/drawingml/2006/picture">
+                  <pic:nvPicPr>
+                    <pic:cNvPr id="780607977" name=""/>
+                    <pic:cNvPicPr/>
+                  </pic:nvPicPr>
+                  <pic:blipFill>
+                    <a:blip r:embed="rId33">
+                      <a:extLst>
+                        <a:ext uri="{28A0092B-C50C-407E-A947-70E740481C1C}">
+                          <a14:useLocalDpi xmlns:a14="http://schemas.microsoft.com/office/drawing/2010/main" val="0"/>
+                        </a:ext>
+                      </a:extLst>
+                    </a:blip>
+                    <a:stretch>
+                      <a:fillRect/>
+                    </a:stretch>
+                  </pic:blipFill>
+                  <pic:spPr>
+                    <a:xfrm>
+                      <a:off x="0" y="0"/>
+                      <a:ext cx="9319651" cy="6184132"/>
+                    </a:xfrm>
+                    <a:prstGeom prst="rect">
+                      <a:avLst/>
+                    </a:prstGeom>
                   </pic:spPr>
                 </pic:pic>
               </a:graphicData>
@@ -3076,8 +4024,7 @@
       </w:r>
     </w:p>
     <w:sectPr>
-      <w:type w:val="continuous"/>
-      <w:pgSz w:w="11906" w:h="16838"/>
+      <w:pgSz w:w="16838" w:h="11906" w:orient="landscape"/>
       <w:pgMar w:top="1440" w:right="1440" w:bottom="1440" w:left="1440" w:header="709" w:footer="709" w:gutter="0"/>
       <w:cols w:space="708"/>
       <w:docGrid w:linePitch="360"/>
@@ -3902,6 +4849,7 @@
   <w:style w:type="character" w:default="1" w:styleId="Fuentedeprrafopredeter">
     <w:name w:val="Default Paragraph Font"/>
     <w:uiPriority w:val="1"/>
+    <w:semiHidden/>
     <w:unhideWhenUsed/>
   </w:style>
   <w:style w:type="table" w:default="1" w:styleId="Tablanormal">

</xml_diff>